<commit_message>
P2: informe amb mes fotos, menys text i mes aire
Sis figures: maquina d'estats, nRF Connect, pantalla del node, port serie,
restabliment i flux de Node-RED. Continua sent de 3 pagines.

Co-Authored-By: Claude Opus 5.5 <noreply@anthropic.com>
Claude-Session: https://claude.ai/code/session_01UnUvVZKn9osMEiiGWQM6PM
</commit_message>
<xml_diff>
--- a/docs/p2/Informe_Practica_2_Pau_Vila.docx
+++ b/docs/p2/Informe_Practica_2_Pau_Vila.docx
@@ -4,60 +4,107 @@
   <w:body>
     <w:p>
       <w:pPr>
-        <w:spacing w:after="60"/>
+        <w:spacing w:after="80"/>
       </w:pPr>
       <w:r>
         <w:rPr>
           <w:b/>
           <w:bCs/>
-          <w:sz w:val="36"/>
-          <w:szCs w:val="36"/>
+          <w:color w:val="1F3864"/>
+          <w:sz w:val="38"/>
+          <w:szCs w:val="38"/>
         </w:rPr>
         <w:t xml:space="preserve">P2 · Configuració del node</w:t>
       </w:r>
     </w:p>
     <w:p>
       <w:pPr>
-        <w:spacing w:after="20"/>
-      </w:pPr>
-      <w:r>
-        <w:rPr>
-          <w:sz w:val="22"/>
-          <w:szCs w:val="22"/>
-        </w:rPr>
-        <w:t xml:space="preserve">Sistemes Encastats</w:t>
-      </w:r>
-    </w:p>
-    <w:p>
-      <w:pPr>
-        <w:spacing w:after="20"/>
-      </w:pPr>
-      <w:r>
-        <w:rPr>
-          <w:sz w:val="22"/>
-          <w:szCs w:val="22"/>
-        </w:rPr>
-        <w:t xml:space="preserve">Grau en Enginyeria Mecatrònica · UVic-UCC · curs 2026-27</w:t>
-      </w:r>
-    </w:p>
-    <w:p>
-      <w:pPr>
-        <w:spacing w:after="20"/>
-      </w:pPr>
-      <w:r>
-        <w:rPr>
-          <w:sz w:val="22"/>
-          <w:szCs w:val="22"/>
+        <w:spacing w:after="30"/>
+      </w:pPr>
+      <w:r>
+        <w:rPr>
+          <w:sz w:val="21"/>
+          <w:szCs w:val="21"/>
+        </w:rPr>
+        <w:t xml:space="preserve">Sistemes Encastats · Grau en Enginyeria Mecatrònica · UVic-UCC · curs 2026-27</w:t>
+      </w:r>
+    </w:p>
+    <w:p>
+      <w:pPr>
+        <w:spacing w:after="30"/>
+      </w:pPr>
+      <w:r>
+        <w:rPr>
+          <w:sz w:val="21"/>
+          <w:szCs w:val="21"/>
         </w:rPr>
         <w:t xml:space="preserve">Pau Vila · Octubre de 2026</w:t>
       </w:r>
     </w:p>
     <w:p>
       <w:pPr>
-        <w:spacing w:after="120"/>
-      </w:pPr>
-      <w:r>
-        <w:t xml:space="preserve">Repositori: github.com/PauVilaP/Practiques_Git. El codi és a </w:t>
+        <w:spacing w:after="60"/>
+      </w:pPr>
+      <w:r>
+        <w:rPr>
+          <w:sz w:val="21"/>
+          <w:szCs w:val="21"/>
+        </w:rPr>
+        <w:t xml:space="preserve">Repositori: github.com/PauVilaP/Practiques_Git (codi a </w:t>
+      </w:r>
+      <w:r>
+        <w:rPr>
+          <w:rFonts w:ascii="Consolas" w:cs="Consolas" w:eastAsia="Consolas" w:hAnsi="Consolas"/>
+          <w:sz w:val="21"/>
+          <w:szCs w:val="21"/>
+        </w:rPr>
+        <w:t xml:space="preserve">firmware/p2/p2_node</w:t>
+      </w:r>
+      <w:r>
+        <w:rPr>
+          <w:sz w:val="21"/>
+          <w:szCs w:val="21"/>
+        </w:rPr>
+        <w:t xml:space="preserve">, flux a </w:t>
+      </w:r>
+      <w:r>
+        <w:rPr>
+          <w:rFonts w:ascii="Consolas" w:cs="Consolas" w:eastAsia="Consolas" w:hAnsi="Consolas"/>
+          <w:sz w:val="21"/>
+          <w:szCs w:val="21"/>
+        </w:rPr>
+        <w:t xml:space="preserve">flows/</w:t>
+      </w:r>
+      <w:r>
+        <w:rPr>
+          <w:sz w:val="21"/>
+          <w:szCs w:val="21"/>
+        </w:rPr>
+        <w:t xml:space="preserve">)</w:t>
+      </w:r>
+    </w:p>
+    <w:p>
+      <w:pPr>
+        <w:keepNext/>
+        <w:spacing w:after="140" w:before="320"/>
+      </w:pPr>
+      <w:r>
+        <w:rPr>
+          <w:b/>
+          <w:bCs/>
+          <w:color w:val="1F3864"/>
+          <w:sz w:val="26"/>
+          <w:szCs w:val="26"/>
+        </w:rPr>
+        <w:t xml:space="preserve">1. Muntatge i màquina d'estats</w:t>
+      </w:r>
+    </w:p>
+    <w:p>
+      <w:pPr>
+        <w:spacing w:after="140" w:line="276"/>
+      </w:pPr>
+      <w:r>
+        <w:t xml:space="preserve">El node és el de la P1: un M5Stack AtomS3 amb el LED a G7, el polsador a G6 i el DHT22 a G8. El gateway és el Raspberry Pi amb Node-RED 4. Tot és al programa </w:t>
       </w:r>
       <w:r>
         <w:rPr>
@@ -65,112 +112,82 @@
           <w:sz w:val="18"/>
           <w:szCs w:val="18"/>
         </w:rPr>
-        <w:t xml:space="preserve">firmware/p2/p2_node</w:t>
-      </w:r>
-      <w:r>
-        <w:t xml:space="preserve"> i el flux de Node-RED a </w:t>
-      </w:r>
-      <w:r>
-        <w:rPr>
-          <w:rFonts w:ascii="Consolas" w:cs="Consolas" w:eastAsia="Consolas" w:hAnsi="Consolas"/>
+        <w:t xml:space="preserve">p2_node.ino</w:t>
+      </w:r>
+      <w:r>
+        <w:t xml:space="preserve">, i les proves es van fer al laboratori el 07/10/2026.</w:t>
+      </w:r>
+    </w:p>
+    <w:p>
+      <w:pPr>
+        <w:keepNext/>
+        <w:spacing w:after="0" w:before="100"/>
+        <w:jc w:val="center"/>
+      </w:pPr>
+      <w:r>
+        <w:drawing>
+          <wp:inline distT="0" distB="0" distL="0" distR="0">
+            <wp:extent cx="6096000" cy="914400"/>
+            <wp:effectExtent t="0" r="0" b="0" l="0"/>
+            <wp:docPr id="1" name="Màquina d'estats" descr="Màquina d'estats" title="Màquina d'estats"/>
+            <wp:cNvGraphicFramePr>
+              <a:graphicFrameLocks xmlns:a="http://schemas.openxmlformats.org/drawingml/2006/main" noChangeAspect="1"/>
+            </wp:cNvGraphicFramePr>
+            <a:graphic xmlns:a="http://schemas.openxmlformats.org/drawingml/2006/main">
+              <a:graphicData uri="http://schemas.openxmlformats.org/drawingml/2006/picture">
+                <pic:pic xmlns:pic="http://schemas.openxmlformats.org/drawingml/2006/picture">
+                  <pic:nvPicPr>
+                    <pic:cNvPr id="0" name="" descr=""/>
+                    <pic:cNvPicPr>
+                      <a:picLocks noChangeAspect="1" noChangeArrowheads="1"/>
+                    </pic:cNvPicPr>
+                  </pic:nvPicPr>
+                  <pic:blipFill>
+                    <a:blip r:embed="rId8" cstate="none"/>
+                    <a:srcRect/>
+                    <a:stretch>
+                      <a:fillRect/>
+                    </a:stretch>
+                  </pic:blipFill>
+                  <pic:spPr bwMode="auto">
+                    <a:xfrm>
+                      <a:off x="0" y="0"/>
+                      <a:ext cx="6096000" cy="914400"/>
+                    </a:xfrm>
+                    <a:prstGeom prst="rect">
+                      <a:avLst/>
+                    </a:prstGeom>
+                  </pic:spPr>
+                </pic:pic>
+              </a:graphicData>
+            </a:graphic>
+          </wp:inline>
+        </w:drawing>
+      </w:r>
+    </w:p>
+    <w:p>
+      <w:pPr>
+        <w:spacing w:after="220" w:before="60"/>
+        <w:jc w:val="center"/>
+      </w:pPr>
+      <w:r>
+        <w:rPr>
+          <w:i/>
+          <w:iCs/>
+          <w:color w:val="404040"/>
           <w:sz w:val="18"/>
           <w:szCs w:val="18"/>
         </w:rPr>
-        <w:t xml:space="preserve">flows/flux_p2_telemetria.json</w:t>
-      </w:r>
-      <w:r>
-        <w:t xml:space="preserve">.</w:t>
+        <w:t xml:space="preserve">Figura 1. Màquina d'estats implementada. Els colors són els de la pantalla del node.</w:t>
       </w:r>
     </w:p>
     <w:p>
       <w:pPr>
         <w:keepNext/>
-        <w:spacing w:after="80" w:before="200"/>
-      </w:pPr>
-      <w:r>
-        <w:rPr>
-          <w:b/>
-          <w:bCs/>
-          <w:sz w:val="25"/>
-          <w:szCs w:val="25"/>
-        </w:rPr>
-        <w:t xml:space="preserve">1. Muntatge i màquina d'estats</w:t>
-      </w:r>
-    </w:p>
-    <w:p>
-      <w:pPr>
-        <w:spacing w:after="90" w:line="259"/>
-      </w:pPr>
-      <w:r>
-        <w:t xml:space="preserve">El node és el de la P1: un M5Stack AtomS3 (ESP32-S3) amb el LED a G7, el polsador a G6 amb el pull-up intern i el DHT22 a G8. El gateway és el Raspberry Pi amb Node-RED 4, connectat a la Wi-Fi Lab-Modul, i el node s'ha configurat des d'un iPhone amb l'nRF Connect. Tots els exercicis són al mateix programa, </w:t>
-      </w:r>
-      <w:r>
-        <w:rPr>
-          <w:rFonts w:ascii="Consolas" w:cs="Consolas" w:eastAsia="Consolas" w:hAnsi="Consolas"/>
-          <w:sz w:val="18"/>
-          <w:szCs w:val="18"/>
-        </w:rPr>
-        <w:t xml:space="preserve">p2_node.ino</w:t>
-      </w:r>
-      <w:r>
-        <w:t xml:space="preserve">, i les proves s'han fet al laboratori el 07/10/2026.</w:t>
-      </w:r>
-    </w:p>
-    <w:p>
-      <w:pPr>
-        <w:spacing w:after="90" w:line="259"/>
-      </w:pPr>
-      <w:r>
-        <w:t xml:space="preserve">La màquina d'estats és la del P-PRE2, amb els noms de l'enunciat. A </w:t>
-      </w:r>
-      <w:r>
-        <w:rPr>
-          <w:b/>
-          <w:bCs/>
-        </w:rPr>
-        <w:t xml:space="preserve">INICI</w:t>
-      </w:r>
-      <w:r>
-        <w:t xml:space="preserve"> el node llegeix la NVS. Si és buida, passa a </w:t>
-      </w:r>
-      <w:r>
-        <w:rPr>
-          <w:b/>
-          <w:bCs/>
-        </w:rPr>
-        <w:t xml:space="preserve">SENSE CREDENCIALS</w:t>
-      </w:r>
-      <w:r>
-        <w:t xml:space="preserve"> i s'anuncia per BLE. Quan rep unes credencials vàlides, passa a </w:t>
-      </w:r>
-      <w:r>
-        <w:rPr>
-          <w:b/>
-          <w:bCs/>
-        </w:rPr>
-        <w:t xml:space="preserve">CONNECTANT</w:t>
-      </w:r>
-      <w:r>
-        <w:t xml:space="preserve">, que fa fins a tres intents de 10 s, i quan té IP passa a </w:t>
-      </w:r>
-      <w:r>
-        <w:rPr>
-          <w:b/>
-          <w:bCs/>
-        </w:rPr>
-        <w:t xml:space="preserve">OPERATIU</w:t>
-      </w:r>
-      <w:r>
-        <w:t xml:space="preserve">, deixa d'anunciar-se i comença a enviar dades. Si cau la Wi-Fi torna a CONNECTANT, i després de tres intents fallits torna a SENSE CREDENCIALS. Des de qualsevol estat, una polsació de més de 5 s fa el restabliment de fàbrica. El LED fa pampallugues a 2 Hz a SENSE CREDENCIALS i a 5 Hz a CONNECTANT, queda fix a OPERATIU i va a 10 Hz durant l'avís de restabliment. La pantalla mostra l'estat, la IP, el temps de configuració, la temperatura i el resultat de l'últim POST.</w:t>
-      </w:r>
-    </w:p>
-    <w:p>
-      <w:pPr>
-        <w:keepNext/>
-        <w:spacing w:after="90" w:line="259"/>
-      </w:pPr>
-      <w:r>
-        <w:t xml:space="preserve">Respecte del P-PRE2 hi ha tres canvis:</w:t>
+        <w:spacing w:after="80" w:line="276"/>
+      </w:pPr>
+      <w:r>
+        <w:t xml:space="preserve">Canvis respecte del P-PRE2:</w:t>
       </w:r>
     </w:p>
     <w:p>
@@ -180,10 +197,10 @@
           <w:ilvl w:val="0"/>
           <w:numId w:val="2"/>
         </w:numPr>
-        <w:spacing w:after="50" w:line="259"/>
-      </w:pPr>
-      <w:r>
-        <w:t xml:space="preserve">El BLE no s'apaga en rebre les credencials, sinó en arribar a OPERATIU, i només s'atura l'anunci. Si s'apagués a CONNECTANT, el mòbil no podria rebre les notificacions de CONNECTANT i d'OPERATIU amb la IP que demana l'enunciat.</w:t>
+        <w:spacing w:after="80" w:line="276"/>
+      </w:pPr>
+      <w:r>
+        <w:t xml:space="preserve">El BLE no s'apaga fins a OPERATIU, perquè el mòbil pugui rebre les notificacions de CONNECTANT i d'OPERATIU.</w:t>
       </w:r>
     </w:p>
     <w:p>
@@ -193,10 +210,10 @@
           <w:ilvl w:val="0"/>
           <w:numId w:val="2"/>
         </w:numPr>
-        <w:spacing w:after="50" w:line="259"/>
-      </w:pPr>
-      <w:r>
-        <w:t xml:space="preserve">Les credencials només es desen a la NVS quan la connexió ha funcionat. Si fallen les que ja hi havia (per exemple, amb el router apagat), el node torna a SENSE CREDENCIALS però no les esborra, tal com proposàvem al B5.</w:t>
+        <w:spacing w:after="80" w:line="276"/>
+      </w:pPr>
+      <w:r>
+        <w:t xml:space="preserve">Les credencials només es desen a la NVS si la connexió funciona.</w:t>
       </w:r>
     </w:p>
     <w:p>
@@ -206,23 +223,24 @@
           <w:ilvl w:val="0"/>
           <w:numId w:val="2"/>
         </w:numPr>
-        <w:spacing w:after="50" w:line="259"/>
-      </w:pPr>
-      <w:r>
-        <w:t xml:space="preserve">El restabliment es fa amb el polsador de la protoboard i no amb el botó de la pantalla, que es prem sense voler només d'agafar l'AtomS3.</w:t>
+        <w:spacing w:after="80" w:line="276"/>
+      </w:pPr>
+      <w:r>
+        <w:t xml:space="preserve">El restabliment es fa amb el polsador de la protoboard i no amb la pantalla, perquè no es dispari sense voler.</w:t>
       </w:r>
     </w:p>
     <w:p>
       <w:pPr>
         <w:keepNext/>
-        <w:spacing w:after="80" w:before="200"/>
+        <w:spacing w:after="140" w:before="320"/>
       </w:pPr>
       <w:r>
         <w:rPr>
           <w:b/>
           <w:bCs/>
-          <w:sz w:val="25"/>
-          <w:szCs w:val="25"/>
+          <w:color w:val="1F3864"/>
+          <w:sz w:val="26"/>
+          <w:szCs w:val="26"/>
         </w:rPr>
         <w:t xml:space="preserve">2. Servidor GATT (exercici 1)</w:t>
       </w:r>
@@ -230,10 +248,10 @@
     <w:p>
       <w:pPr>
         <w:keepNext/>
-        <w:spacing w:after="90" w:line="259"/>
-      </w:pPr>
-      <w:r>
-        <w:t xml:space="preserve">El servei de configuració és propi i té tres característiques. Tots els UUID són de 128 bits i s'han generat a l'atzar:</w:t>
+        <w:spacing w:after="140" w:line="276"/>
+      </w:pPr>
+      <w:r>
+        <w:t xml:space="preserve">Servei propi amb tres característiques. Tots els UUID són de 128 bits, generats a l'atzar:</w:t>
       </w:r>
     </w:p>
     <w:tbl>
@@ -269,10 +287,10 @@
             </w:tcBorders>
             <w:shd w:fill="E7E6E6" w:color="auto" w:val="clear"/>
             <w:tcMar>
-              <w:top w:type="dxa" w:w="30"/>
-              <w:left w:type="dxa" w:w="90"/>
-              <w:bottom w:type="dxa" w:w="30"/>
-              <w:right w:type="dxa" w:w="90"/>
+              <w:top w:type="dxa" w:w="50"/>
+              <w:left w:type="dxa" w:w="100"/>
+              <w:bottom w:type="dxa" w:w="50"/>
+              <w:right w:type="dxa" w:w="100"/>
             </w:tcMar>
           </w:tcPr>
           <w:p>
@@ -293,10 +311,10 @@
             </w:tcBorders>
             <w:shd w:fill="E7E6E6" w:color="auto" w:val="clear"/>
             <w:tcMar>
-              <w:top w:type="dxa" w:w="30"/>
-              <w:left w:type="dxa" w:w="90"/>
-              <w:bottom w:type="dxa" w:w="30"/>
-              <w:right w:type="dxa" w:w="90"/>
+              <w:top w:type="dxa" w:w="50"/>
+              <w:left w:type="dxa" w:w="100"/>
+              <w:bottom w:type="dxa" w:w="50"/>
+              <w:right w:type="dxa" w:w="100"/>
             </w:tcMar>
           </w:tcPr>
           <w:p>
@@ -326,10 +344,10 @@
             </w:tcBorders>
             <w:shd w:fill="E7E6E6" w:color="auto" w:val="clear"/>
             <w:tcMar>
-              <w:top w:type="dxa" w:w="30"/>
-              <w:left w:type="dxa" w:w="90"/>
-              <w:bottom w:type="dxa" w:w="30"/>
-              <w:right w:type="dxa" w:w="90"/>
+              <w:top w:type="dxa" w:w="50"/>
+              <w:left w:type="dxa" w:w="100"/>
+              <w:bottom w:type="dxa" w:w="50"/>
+              <w:right w:type="dxa" w:w="100"/>
             </w:tcMar>
           </w:tcPr>
           <w:p>
@@ -363,10 +381,10 @@
               <w:right w:val="single" w:color="A6A6A6" w:sz="4"/>
             </w:tcBorders>
             <w:tcMar>
-              <w:top w:type="dxa" w:w="30"/>
-              <w:left w:type="dxa" w:w="90"/>
-              <w:bottom w:type="dxa" w:w="30"/>
-              <w:right w:type="dxa" w:w="90"/>
+              <w:top w:type="dxa" w:w="50"/>
+              <w:left w:type="dxa" w:w="100"/>
+              <w:bottom w:type="dxa" w:w="50"/>
+              <w:right w:type="dxa" w:w="100"/>
             </w:tcMar>
           </w:tcPr>
           <w:p>
@@ -393,10 +411,10 @@
               <w:right w:val="single" w:color="A6A6A6" w:sz="4"/>
             </w:tcBorders>
             <w:tcMar>
-              <w:top w:type="dxa" w:w="30"/>
-              <w:left w:type="dxa" w:w="90"/>
-              <w:bottom w:type="dxa" w:w="30"/>
-              <w:right w:type="dxa" w:w="90"/>
+              <w:top w:type="dxa" w:w="50"/>
+              <w:left w:type="dxa" w:w="100"/>
+              <w:bottom w:type="dxa" w:w="50"/>
+              <w:right w:type="dxa" w:w="100"/>
             </w:tcMar>
           </w:tcPr>
           <w:p>
@@ -423,10 +441,10 @@
               <w:right w:val="single" w:color="A6A6A6" w:sz="4"/>
             </w:tcBorders>
             <w:tcMar>
-              <w:top w:type="dxa" w:w="30"/>
-              <w:left w:type="dxa" w:w="90"/>
-              <w:bottom w:type="dxa" w:w="30"/>
-              <w:right w:type="dxa" w:w="90"/>
+              <w:top w:type="dxa" w:w="50"/>
+              <w:left w:type="dxa" w:w="100"/>
+              <w:bottom w:type="dxa" w:w="50"/>
+              <w:right w:type="dxa" w:w="100"/>
             </w:tcMar>
           </w:tcPr>
           <w:p>
@@ -458,10 +476,10 @@
               <w:right w:val="single" w:color="A6A6A6" w:sz="4"/>
             </w:tcBorders>
             <w:tcMar>
-              <w:top w:type="dxa" w:w="30"/>
-              <w:left w:type="dxa" w:w="90"/>
-              <w:bottom w:type="dxa" w:w="30"/>
-              <w:right w:type="dxa" w:w="90"/>
+              <w:top w:type="dxa" w:w="50"/>
+              <w:left w:type="dxa" w:w="100"/>
+              <w:bottom w:type="dxa" w:w="50"/>
+              <w:right w:type="dxa" w:w="100"/>
             </w:tcMar>
           </w:tcPr>
           <w:p>
@@ -488,10 +506,10 @@
               <w:right w:val="single" w:color="A6A6A6" w:sz="4"/>
             </w:tcBorders>
             <w:tcMar>
-              <w:top w:type="dxa" w:w="30"/>
-              <w:left w:type="dxa" w:w="90"/>
-              <w:bottom w:type="dxa" w:w="30"/>
-              <w:right w:type="dxa" w:w="90"/>
+              <w:top w:type="dxa" w:w="50"/>
+              <w:left w:type="dxa" w:w="100"/>
+              <w:bottom w:type="dxa" w:w="50"/>
+              <w:right w:type="dxa" w:w="100"/>
             </w:tcMar>
           </w:tcPr>
           <w:p>
@@ -518,10 +536,10 @@
               <w:right w:val="single" w:color="A6A6A6" w:sz="4"/>
             </w:tcBorders>
             <w:tcMar>
-              <w:top w:type="dxa" w:w="30"/>
-              <w:left w:type="dxa" w:w="90"/>
-              <w:bottom w:type="dxa" w:w="30"/>
-              <w:right w:type="dxa" w:w="90"/>
+              <w:top w:type="dxa" w:w="50"/>
+              <w:left w:type="dxa" w:w="100"/>
+              <w:bottom w:type="dxa" w:w="50"/>
+              <w:right w:type="dxa" w:w="100"/>
             </w:tcMar>
           </w:tcPr>
           <w:p>
@@ -553,10 +571,10 @@
               <w:right w:val="single" w:color="A6A6A6" w:sz="4"/>
             </w:tcBorders>
             <w:tcMar>
-              <w:top w:type="dxa" w:w="30"/>
-              <w:left w:type="dxa" w:w="90"/>
-              <w:bottom w:type="dxa" w:w="30"/>
-              <w:right w:type="dxa" w:w="90"/>
+              <w:top w:type="dxa" w:w="50"/>
+              <w:left w:type="dxa" w:w="100"/>
+              <w:bottom w:type="dxa" w:w="50"/>
+              <w:right w:type="dxa" w:w="100"/>
             </w:tcMar>
           </w:tcPr>
           <w:p>
@@ -583,10 +601,10 @@
               <w:right w:val="single" w:color="A6A6A6" w:sz="4"/>
             </w:tcBorders>
             <w:tcMar>
-              <w:top w:type="dxa" w:w="30"/>
-              <w:left w:type="dxa" w:w="90"/>
-              <w:bottom w:type="dxa" w:w="30"/>
-              <w:right w:type="dxa" w:w="90"/>
+              <w:top w:type="dxa" w:w="50"/>
+              <w:left w:type="dxa" w:w="100"/>
+              <w:bottom w:type="dxa" w:w="50"/>
+              <w:right w:type="dxa" w:w="100"/>
             </w:tcMar>
           </w:tcPr>
           <w:p>
@@ -613,10 +631,10 @@
               <w:right w:val="single" w:color="A6A6A6" w:sz="4"/>
             </w:tcBorders>
             <w:tcMar>
-              <w:top w:type="dxa" w:w="30"/>
-              <w:left w:type="dxa" w:w="90"/>
-              <w:bottom w:type="dxa" w:w="30"/>
-              <w:right w:type="dxa" w:w="90"/>
+              <w:top w:type="dxa" w:w="50"/>
+              <w:left w:type="dxa" w:w="100"/>
+              <w:bottom w:type="dxa" w:w="50"/>
+              <w:right w:type="dxa" w:w="100"/>
             </w:tcMar>
           </w:tcPr>
           <w:p>
@@ -648,10 +666,10 @@
               <w:right w:val="single" w:color="A6A6A6" w:sz="4"/>
             </w:tcBorders>
             <w:tcMar>
-              <w:top w:type="dxa" w:w="30"/>
-              <w:left w:type="dxa" w:w="90"/>
-              <w:bottom w:type="dxa" w:w="30"/>
-              <w:right w:type="dxa" w:w="90"/>
+              <w:top w:type="dxa" w:w="50"/>
+              <w:left w:type="dxa" w:w="100"/>
+              <w:bottom w:type="dxa" w:w="50"/>
+              <w:right w:type="dxa" w:w="100"/>
             </w:tcMar>
           </w:tcPr>
           <w:p>
@@ -678,10 +696,10 @@
               <w:right w:val="single" w:color="A6A6A6" w:sz="4"/>
             </w:tcBorders>
             <w:tcMar>
-              <w:top w:type="dxa" w:w="30"/>
-              <w:left w:type="dxa" w:w="90"/>
-              <w:bottom w:type="dxa" w:w="30"/>
-              <w:right w:type="dxa" w:w="90"/>
+              <w:top w:type="dxa" w:w="50"/>
+              <w:left w:type="dxa" w:w="100"/>
+              <w:bottom w:type="dxa" w:w="50"/>
+              <w:right w:type="dxa" w:w="100"/>
             </w:tcMar>
           </w:tcPr>
           <w:p>
@@ -708,10 +726,10 @@
               <w:right w:val="single" w:color="A6A6A6" w:sz="4"/>
             </w:tcBorders>
             <w:tcMar>
-              <w:top w:type="dxa" w:w="30"/>
-              <w:left w:type="dxa" w:w="90"/>
-              <w:bottom w:type="dxa" w:w="30"/>
-              <w:right w:type="dxa" w:w="90"/>
+              <w:top w:type="dxa" w:w="50"/>
+              <w:left w:type="dxa" w:w="100"/>
+              <w:bottom w:type="dxa" w:w="50"/>
+              <w:right w:type="dxa" w:w="100"/>
             </w:tcMar>
           </w:tcPr>
           <w:p>
@@ -743,13 +761,16 @@
         </w:tblBorders>
       </w:tblPr>
       <w:tblGrid>
-        <w:gridCol w:w="5600"/>
-        <w:gridCol w:w="4038"/>
+        <w:gridCol w:w="5300"/>
+        <w:gridCol w:w="4338"/>
       </w:tblGrid>
       <w:tr>
-        <w:tc>
-          <w:tcPr>
-            <w:tcW w:type="dxa" w:w="5600"/>
+        <w:trPr>
+          <w:cantSplit/>
+        </w:trPr>
+        <w:tc>
+          <w:tcPr>
+            <w:tcW w:type="dxa" w:w="5300"/>
             <w:tcBorders>
               <w:top w:val="none" w:color="FFFFFF" w:sz="0"/>
               <w:left w:val="none" w:color="FFFFFF" w:sz="0"/>
@@ -757,17 +778,17 @@
               <w:right w:val="none" w:color="FFFFFF" w:sz="0"/>
             </w:tcBorders>
             <w:tcMar>
-              <w:top w:type="dxa" w:w="100"/>
+              <w:top w:type="dxa" w:w="120"/>
               <w:left w:type="dxa" w:w="0"/>
-              <w:right w:type="dxa" w:w="200"/>
-            </w:tcMar>
-          </w:tcPr>
-          <w:p>
-            <w:pPr>
-              <w:spacing w:after="90" w:line="259"/>
-            </w:pPr>
-            <w:r>
-              <w:t xml:space="preserve">Les característiques que notifiquen porten el descriptor 2902. El node s'anuncia com a </w:t>
+              <w:right w:type="dxa" w:w="240"/>
+            </w:tcMar>
+          </w:tcPr>
+          <w:p>
+            <w:pPr>
+              <w:spacing w:after="140" w:line="276"/>
+            </w:pPr>
+            <w:r>
+              <w:t xml:space="preserve">El node s'anuncia com a </w:t>
             </w:r>
             <w:r>
               <w:rPr>
@@ -777,21 +798,21 @@
               <w:t xml:space="preserve">Node-Pau</w:t>
             </w:r>
             <w:r>
-              <w:t xml:space="preserve"> amb el UUID del servei dins de l'anunci, i a l'nRF Connect es veuen el servei anunciat i les tres característiques (figura 1).</w:t>
-            </w:r>
-          </w:p>
-          <w:p>
-            <w:pPr>
-              <w:spacing w:after="90" w:line="259"/>
-            </w:pPr>
-            <w:r>
-              <w:t xml:space="preserve">El node notifica cada canvi d'estat, però amb l'nRF Connect per a iOS el descriptor 2902 sempre quedava a «Disabled»: el mòbil no arribava a activar les notificacions i no n'ha rebut cap. Per això els canvis d'estat s'han comprovat llegint la característica estat i amb el port sèrie.</w:t>
-            </w:r>
-          </w:p>
-        </w:tc>
-        <w:tc>
-          <w:tcPr>
-            <w:tcW w:type="dxa" w:w="4038"/>
+              <w:t xml:space="preserve"> amb el UUID del servei, i les característiques que notifiquen porten el descriptor 2902 (figura 2).</w:t>
+            </w:r>
+          </w:p>
+          <w:p>
+            <w:pPr>
+              <w:spacing w:after="140" w:line="276"/>
+            </w:pPr>
+            <w:r>
+              <w:t xml:space="preserve">Amb l'nRF Connect per a iOS el 2902 sempre quedava a «Disabled» i el mòbil no rebia les notificacions. Per això els canvis d'estat es van comprovar llegint la característica estat i pel port sèrie.</w:t>
+            </w:r>
+          </w:p>
+        </w:tc>
+        <w:tc>
+          <w:tcPr>
+            <w:tcW w:type="dxa" w:w="4338"/>
             <w:tcBorders>
               <w:top w:val="none" w:color="FFFFFF" w:sz="0"/>
               <w:left w:val="none" w:color="FFFFFF" w:sz="0"/>
@@ -800,20 +821,20 @@
             </w:tcBorders>
             <w:tcMar>
               <w:top w:type="dxa" w:w="0"/>
-              <w:left w:type="dxa" w:w="100"/>
+              <w:left w:type="dxa" w:w="120"/>
               <w:right w:type="dxa" w:w="0"/>
             </w:tcMar>
           </w:tcPr>
           <w:p>
             <w:pPr>
               <w:keepNext/>
-              <w:spacing w:after="0" w:before="80"/>
+              <w:spacing w:after="0" w:before="100"/>
               <w:jc w:val="center"/>
             </w:pPr>
             <w:r>
               <w:drawing>
                 <wp:inline distT="0" distB="0" distL="0" distR="0">
-                  <wp:extent cx="2428875" cy="1800225"/>
+                  <wp:extent cx="2667000" cy="1971675"/>
                   <wp:effectExtent t="0" r="0" b="0" l="0"/>
                   <wp:docPr id="1" name="Captures de l'nRF Connect" descr="Captures de l'nRF Connect" title="Captures de l'nRF Connect"/>
                   <wp:cNvGraphicFramePr>
@@ -829,7 +850,7 @@
                           </pic:cNvPicPr>
                         </pic:nvPicPr>
                         <pic:blipFill>
-                          <a:blip r:embed="rId8" cstate="none"/>
+                          <a:blip r:embed="rId9" cstate="none"/>
                           <a:srcRect/>
                           <a:stretch>
                             <a:fillRect/>
@@ -838,7 +859,7 @@
                         <pic:spPr bwMode="auto">
                           <a:xfrm>
                             <a:off x="0" y="0"/>
-                            <a:ext cx="2428875" cy="1800225"/>
+                            <a:ext cx="2667000" cy="1971675"/>
                           </a:xfrm>
                           <a:prstGeom prst="rect">
                             <a:avLst/>
@@ -853,17 +874,18 @@
           </w:p>
           <w:p>
             <w:pPr>
-              <w:spacing w:after="140" w:before="40"/>
+              <w:spacing w:after="220" w:before="60"/>
               <w:jc w:val="center"/>
             </w:pPr>
             <w:r>
               <w:rPr>
                 <w:i/>
                 <w:iCs/>
+                <w:color w:val="404040"/>
                 <w:sz w:val="18"/>
                 <w:szCs w:val="18"/>
               </w:rPr>
-              <w:t xml:space="preserve">Figura 1. nRF Connect: servei anunciat i taula GATT del node.</w:t>
+              <w:t xml:space="preserve">Figura 2. nRF Connect: servei anunciat i característiques.</w:t>
             </w:r>
           </w:p>
         </w:tc>
@@ -872,24 +894,25 @@
     <w:p>
       <w:pPr>
         <w:keepNext/>
-        <w:spacing w:after="80" w:before="200"/>
+        <w:spacing w:after="140" w:before="320"/>
       </w:pPr>
       <w:r>
         <w:rPr>
           <w:b/>
           <w:bCs/>
-          <w:sz w:val="25"/>
-          <w:szCs w:val="25"/>
+          <w:color w:val="1F3864"/>
+          <w:sz w:val="26"/>
+          <w:szCs w:val="26"/>
         </w:rPr>
         <w:t xml:space="preserve">3. Provisioning de la Wi-Fi (exercici 2)</w:t>
       </w:r>
     </w:p>
     <w:p>
       <w:pPr>
-        <w:spacing w:after="90" w:line="259"/>
-      </w:pPr>
-      <w:r>
-        <w:t xml:space="preserve">La característica credencials rep </w:t>
+        <w:spacing w:after="140" w:line="276"/>
+      </w:pPr>
+      <w:r>
+        <w:t xml:space="preserve">El mòbil escriu </w:t>
       </w:r>
       <w:r>
         <w:rPr>
@@ -900,67 +923,142 @@
         <w:t xml:space="preserve">{"ssid":"…","pass":"…"}</w:t>
       </w:r>
       <w:r>
-        <w:t xml:space="preserve">. El node la valida amb ArduinoJson: hi ha d'haver els dos camps, el SSID ha de tenir d'1 a 32 caràcters i la clau, 63 com a màxim. Si no és vàlida, notifica «SENSE CREDENCIALS (JSON invalid)». Si ho és, notifica CONNECTANT de seguida i intenta connectar-se. Quan té IP, desa el SSID i la clau a l'espai de noms </w:t>
-      </w:r>
-      <w:r>
-        <w:rPr>
-          <w:rFonts w:ascii="Consolas" w:cs="Consolas" w:eastAsia="Consolas" w:hAnsi="Consolas"/>
+        <w:t xml:space="preserve"> a credencials. El node valida el JSON, notifica CONNECTANT i fa fins a 3 intents de 10 s. Quan té IP, desa les credencials a la NVS, notifica OPERATIU amb la IP i ho mostra a la pantalla (figura 3). Al port sèrie només surten el SSID i la longitud de la clau (figura 4).</w:t>
+      </w:r>
+    </w:p>
+    <w:p>
+      <w:pPr>
+        <w:keepNext/>
+        <w:spacing w:after="0" w:before="100"/>
+        <w:jc w:val="center"/>
+      </w:pPr>
+      <w:r>
+        <w:drawing>
+          <wp:inline distT="0" distB="0" distL="0" distR="0">
+            <wp:extent cx="3238500" cy="1590675"/>
+            <wp:effectExtent t="0" r="0" b="0" l="0"/>
+            <wp:docPr id="1" name="Pantalla del node" descr="Pantalla del node" title="Pantalla del node"/>
+            <wp:cNvGraphicFramePr>
+              <a:graphicFrameLocks xmlns:a="http://schemas.openxmlformats.org/drawingml/2006/main" noChangeAspect="1"/>
+            </wp:cNvGraphicFramePr>
+            <a:graphic xmlns:a="http://schemas.openxmlformats.org/drawingml/2006/main">
+              <a:graphicData uri="http://schemas.openxmlformats.org/drawingml/2006/picture">
+                <pic:pic xmlns:pic="http://schemas.openxmlformats.org/drawingml/2006/picture">
+                  <pic:nvPicPr>
+                    <pic:cNvPr id="0" name="" descr=""/>
+                    <pic:cNvPicPr>
+                      <a:picLocks noChangeAspect="1" noChangeArrowheads="1"/>
+                    </pic:cNvPicPr>
+                  </pic:nvPicPr>
+                  <pic:blipFill>
+                    <a:blip r:embed="rId10" cstate="none"/>
+                    <a:srcRect/>
+                    <a:stretch>
+                      <a:fillRect/>
+                    </a:stretch>
+                  </pic:blipFill>
+                  <pic:spPr bwMode="auto">
+                    <a:xfrm>
+                      <a:off x="0" y="0"/>
+                      <a:ext cx="3238500" cy="1590675"/>
+                    </a:xfrm>
+                    <a:prstGeom prst="rect">
+                      <a:avLst/>
+                    </a:prstGeom>
+                  </pic:spPr>
+                </pic:pic>
+              </a:graphicData>
+            </a:graphic>
+          </wp:inline>
+        </w:drawing>
+      </w:r>
+    </w:p>
+    <w:p>
+      <w:pPr>
+        <w:spacing w:after="220" w:before="60"/>
+        <w:jc w:val="center"/>
+      </w:pPr>
+      <w:r>
+        <w:rPr>
+          <w:i/>
+          <w:iCs/>
+          <w:color w:val="404040"/>
           <w:sz w:val="18"/>
           <w:szCs w:val="18"/>
         </w:rPr>
-        <w:t xml:space="preserve">wifi</w:t>
-      </w:r>
-      <w:r>
-        <w:t xml:space="preserve"> de la NVS, notifica «OPERATIU 10.11.2.22» i deixa d'anunciar-se. Al port sèrie només surten el SSID i la longitud de la clau.</w:t>
-      </w:r>
-    </w:p>
-    <w:p>
-      <w:pPr>
-        <w:pStyle w:val="ListParagraph"/>
-        <w:numPr>
-          <w:ilvl w:val="0"/>
-          <w:numId w:val="2"/>
-        </w:numPr>
-        <w:spacing w:after="50" w:line="259"/>
-      </w:pPr>
-      <w:r>
-        <w:rPr>
-          <w:b/>
-          <w:bCs/>
-        </w:rPr>
-        <w:t xml:space="preserve">Clau incorrecta:</w:t>
-      </w:r>
-      <w:r>
-        <w:t xml:space="preserve"> tres intents de 10 s i «SENSE CREDENCIALS (3 intents fallits)». Les escriptures que arribaven durant CONNECTANT s'ignoraven, i després d'un reset la NVS era buida: la clau incorrecta no s'havia desat.</w:t>
-      </w:r>
-    </w:p>
-    <w:p>
-      <w:pPr>
-        <w:pStyle w:val="ListParagraph"/>
-        <w:numPr>
-          <w:ilvl w:val="0"/>
-          <w:numId w:val="2"/>
-        </w:numPr>
-        <w:spacing w:after="50" w:line="259"/>
-      </w:pPr>
-      <w:r>
-        <w:rPr>
-          <w:b/>
-          <w:bCs/>
-        </w:rPr>
-        <w:t xml:space="preserve">Reinici amb credencials bones:</w:t>
-      </w:r>
-      <w:r>
-        <w:t xml:space="preserve"> «NVS: SSID "Lab-Modul" trobat. Em connecto sense passar per BLE» i OPERATIU al primer intent, sense tocar el mòbil.</w:t>
+        <w:t xml:space="preserve">Figura 3. Pantalla del node esperant credencials i en OPERATIU (IP, temps de configuració, temperatura i últim POST).</w:t>
       </w:r>
     </w:p>
     <w:p>
       <w:pPr>
         <w:keepNext/>
-        <w:spacing w:after="60" w:before="80" w:line="259"/>
-      </w:pPr>
-      <w:r>
-        <w:t xml:space="preserve">Temps des que el node rep les credencials fins que té IP, mesurat pel mateix node:</w:t>
+        <w:spacing w:after="0" w:before="100"/>
+        <w:jc w:val="center"/>
+      </w:pPr>
+      <w:r>
+        <w:drawing>
+          <wp:inline distT="0" distB="0" distL="0" distR="0">
+            <wp:extent cx="5715000" cy="1933575"/>
+            <wp:effectExtent t="0" r="0" b="0" l="0"/>
+            <wp:docPr id="1" name="Port sèrie" descr="Port sèrie" title="Port sèrie"/>
+            <wp:cNvGraphicFramePr>
+              <a:graphicFrameLocks xmlns:a="http://schemas.openxmlformats.org/drawingml/2006/main" noChangeAspect="1"/>
+            </wp:cNvGraphicFramePr>
+            <a:graphic xmlns:a="http://schemas.openxmlformats.org/drawingml/2006/main">
+              <a:graphicData uri="http://schemas.openxmlformats.org/drawingml/2006/picture">
+                <pic:pic xmlns:pic="http://schemas.openxmlformats.org/drawingml/2006/picture">
+                  <pic:nvPicPr>
+                    <pic:cNvPr id="0" name="" descr=""/>
+                    <pic:cNvPicPr>
+                      <a:picLocks noChangeAspect="1" noChangeArrowheads="1"/>
+                    </pic:cNvPicPr>
+                  </pic:nvPicPr>
+                  <pic:blipFill>
+                    <a:blip r:embed="rId11" cstate="none"/>
+                    <a:srcRect/>
+                    <a:stretch>
+                      <a:fillRect/>
+                    </a:stretch>
+                  </pic:blipFill>
+                  <pic:spPr bwMode="auto">
+                    <a:xfrm>
+                      <a:off x="0" y="0"/>
+                      <a:ext cx="5715000" cy="1933575"/>
+                    </a:xfrm>
+                    <a:prstGeom prst="rect">
+                      <a:avLst/>
+                    </a:prstGeom>
+                  </pic:spPr>
+                </pic:pic>
+              </a:graphicData>
+            </a:graphic>
+          </wp:inline>
+        </w:drawing>
+      </w:r>
+    </w:p>
+    <w:p>
+      <w:pPr>
+        <w:spacing w:after="220" w:before="60"/>
+        <w:jc w:val="center"/>
+      </w:pPr>
+      <w:r>
+        <w:rPr>
+          <w:i/>
+          <w:iCs/>
+          <w:color w:val="404040"/>
+          <w:sz w:val="18"/>
+          <w:szCs w:val="18"/>
+        </w:rPr>
+        <w:t xml:space="preserve">Figura 4. Port sèrie: configuració correcta (esquerra) i amb una clau incorrecta (dreta).</w:t>
+      </w:r>
+    </w:p>
+    <w:p>
+      <w:pPr>
+        <w:keepNext/>
+        <w:spacing w:after="80" w:line="276"/>
+      </w:pPr>
+      <w:r>
+        <w:t xml:space="preserve">Temps des que el node rep les credencials fins que té IP:</w:t>
       </w:r>
     </w:p>
     <w:tbl>
@@ -1001,10 +1099,10 @@
             </w:tcBorders>
             <w:shd w:fill="E7E6E6" w:color="auto" w:val="clear"/>
             <w:tcMar>
-              <w:top w:type="dxa" w:w="30"/>
-              <w:left w:type="dxa" w:w="90"/>
-              <w:bottom w:type="dxa" w:w="30"/>
-              <w:right w:type="dxa" w:w="90"/>
+              <w:top w:type="dxa" w:w="50"/>
+              <w:left w:type="dxa" w:w="100"/>
+              <w:bottom w:type="dxa" w:w="50"/>
+              <w:right w:type="dxa" w:w="100"/>
             </w:tcMar>
           </w:tcPr>
           <w:p>
@@ -1034,10 +1132,10 @@
             </w:tcBorders>
             <w:shd w:fill="E7E6E6" w:color="auto" w:val="clear"/>
             <w:tcMar>
-              <w:top w:type="dxa" w:w="30"/>
-              <w:left w:type="dxa" w:w="90"/>
-              <w:bottom w:type="dxa" w:w="30"/>
-              <w:right w:type="dxa" w:w="90"/>
+              <w:top w:type="dxa" w:w="50"/>
+              <w:left w:type="dxa" w:w="100"/>
+              <w:bottom w:type="dxa" w:w="50"/>
+              <w:right w:type="dxa" w:w="100"/>
             </w:tcMar>
           </w:tcPr>
           <w:p>
@@ -1067,10 +1165,10 @@
             </w:tcBorders>
             <w:shd w:fill="E7E6E6" w:color="auto" w:val="clear"/>
             <w:tcMar>
-              <w:top w:type="dxa" w:w="30"/>
-              <w:left w:type="dxa" w:w="90"/>
-              <w:bottom w:type="dxa" w:w="30"/>
-              <w:right w:type="dxa" w:w="90"/>
+              <w:top w:type="dxa" w:w="50"/>
+              <w:left w:type="dxa" w:w="100"/>
+              <w:bottom w:type="dxa" w:w="50"/>
+              <w:right w:type="dxa" w:w="100"/>
             </w:tcMar>
           </w:tcPr>
           <w:p>
@@ -1100,10 +1198,10 @@
             </w:tcBorders>
             <w:shd w:fill="E7E6E6" w:color="auto" w:val="clear"/>
             <w:tcMar>
-              <w:top w:type="dxa" w:w="30"/>
-              <w:left w:type="dxa" w:w="90"/>
-              <w:bottom w:type="dxa" w:w="30"/>
-              <w:right w:type="dxa" w:w="90"/>
+              <w:top w:type="dxa" w:w="50"/>
+              <w:left w:type="dxa" w:w="100"/>
+              <w:bottom w:type="dxa" w:w="50"/>
+              <w:right w:type="dxa" w:w="100"/>
             </w:tcMar>
           </w:tcPr>
           <w:p>
@@ -1133,10 +1231,10 @@
             </w:tcBorders>
             <w:shd w:fill="E7E6E6" w:color="auto" w:val="clear"/>
             <w:tcMar>
-              <w:top w:type="dxa" w:w="30"/>
-              <w:left w:type="dxa" w:w="90"/>
-              <w:bottom w:type="dxa" w:w="30"/>
-              <w:right w:type="dxa" w:w="90"/>
+              <w:top w:type="dxa" w:w="50"/>
+              <w:left w:type="dxa" w:w="100"/>
+              <w:bottom w:type="dxa" w:w="50"/>
+              <w:right w:type="dxa" w:w="100"/>
             </w:tcMar>
           </w:tcPr>
           <w:p>
@@ -1166,10 +1264,10 @@
             </w:tcBorders>
             <w:shd w:fill="E7E6E6" w:color="auto" w:val="clear"/>
             <w:tcMar>
-              <w:top w:type="dxa" w:w="30"/>
-              <w:left w:type="dxa" w:w="90"/>
-              <w:bottom w:type="dxa" w:w="30"/>
-              <w:right w:type="dxa" w:w="90"/>
+              <w:top w:type="dxa" w:w="50"/>
+              <w:left w:type="dxa" w:w="100"/>
+              <w:bottom w:type="dxa" w:w="50"/>
+              <w:right w:type="dxa" w:w="100"/>
             </w:tcMar>
           </w:tcPr>
           <w:p>
@@ -1199,10 +1297,10 @@
             </w:tcBorders>
             <w:shd w:fill="E7E6E6" w:color="auto" w:val="clear"/>
             <w:tcMar>
-              <w:top w:type="dxa" w:w="30"/>
-              <w:left w:type="dxa" w:w="90"/>
-              <w:bottom w:type="dxa" w:w="30"/>
-              <w:right w:type="dxa" w:w="90"/>
+              <w:top w:type="dxa" w:w="50"/>
+              <w:left w:type="dxa" w:w="100"/>
+              <w:bottom w:type="dxa" w:w="50"/>
+              <w:right w:type="dxa" w:w="100"/>
             </w:tcMar>
           </w:tcPr>
           <w:p>
@@ -1232,10 +1330,10 @@
             </w:tcBorders>
             <w:shd w:fill="E7E6E6" w:color="auto" w:val="clear"/>
             <w:tcMar>
-              <w:top w:type="dxa" w:w="30"/>
-              <w:left w:type="dxa" w:w="90"/>
-              <w:bottom w:type="dxa" w:w="30"/>
-              <w:right w:type="dxa" w:w="90"/>
+              <w:top w:type="dxa" w:w="50"/>
+              <w:left w:type="dxa" w:w="100"/>
+              <w:bottom w:type="dxa" w:w="50"/>
+              <w:right w:type="dxa" w:w="100"/>
             </w:tcMar>
           </w:tcPr>
           <w:p>
@@ -1269,10 +1367,10 @@
               <w:right w:val="single" w:color="A6A6A6" w:sz="4"/>
             </w:tcBorders>
             <w:tcMar>
-              <w:top w:type="dxa" w:w="30"/>
-              <w:left w:type="dxa" w:w="90"/>
-              <w:bottom w:type="dxa" w:w="30"/>
-              <w:right w:type="dxa" w:w="90"/>
+              <w:top w:type="dxa" w:w="50"/>
+              <w:left w:type="dxa" w:w="100"/>
+              <w:bottom w:type="dxa" w:w="50"/>
+              <w:right w:type="dxa" w:w="100"/>
             </w:tcMar>
           </w:tcPr>
           <w:p>
@@ -1299,10 +1397,10 @@
               <w:right w:val="single" w:color="A6A6A6" w:sz="4"/>
             </w:tcBorders>
             <w:tcMar>
-              <w:top w:type="dxa" w:w="30"/>
-              <w:left w:type="dxa" w:w="90"/>
-              <w:bottom w:type="dxa" w:w="30"/>
-              <w:right w:type="dxa" w:w="90"/>
+              <w:top w:type="dxa" w:w="50"/>
+              <w:left w:type="dxa" w:w="100"/>
+              <w:bottom w:type="dxa" w:w="50"/>
+              <w:right w:type="dxa" w:w="100"/>
             </w:tcMar>
           </w:tcPr>
           <w:p>
@@ -1329,10 +1427,10 @@
               <w:right w:val="single" w:color="A6A6A6" w:sz="4"/>
             </w:tcBorders>
             <w:tcMar>
-              <w:top w:type="dxa" w:w="30"/>
-              <w:left w:type="dxa" w:w="90"/>
-              <w:bottom w:type="dxa" w:w="30"/>
-              <w:right w:type="dxa" w:w="90"/>
+              <w:top w:type="dxa" w:w="50"/>
+              <w:left w:type="dxa" w:w="100"/>
+              <w:bottom w:type="dxa" w:w="50"/>
+              <w:right w:type="dxa" w:w="100"/>
             </w:tcMar>
           </w:tcPr>
           <w:p>
@@ -1359,10 +1457,10 @@
               <w:right w:val="single" w:color="A6A6A6" w:sz="4"/>
             </w:tcBorders>
             <w:tcMar>
-              <w:top w:type="dxa" w:w="30"/>
-              <w:left w:type="dxa" w:w="90"/>
-              <w:bottom w:type="dxa" w:w="30"/>
-              <w:right w:type="dxa" w:w="90"/>
+              <w:top w:type="dxa" w:w="50"/>
+              <w:left w:type="dxa" w:w="100"/>
+              <w:bottom w:type="dxa" w:w="50"/>
+              <w:right w:type="dxa" w:w="100"/>
             </w:tcMar>
           </w:tcPr>
           <w:p>
@@ -1389,10 +1487,10 @@
               <w:right w:val="single" w:color="A6A6A6" w:sz="4"/>
             </w:tcBorders>
             <w:tcMar>
-              <w:top w:type="dxa" w:w="30"/>
-              <w:left w:type="dxa" w:w="90"/>
-              <w:bottom w:type="dxa" w:w="30"/>
-              <w:right w:type="dxa" w:w="90"/>
+              <w:top w:type="dxa" w:w="50"/>
+              <w:left w:type="dxa" w:w="100"/>
+              <w:bottom w:type="dxa" w:w="50"/>
+              <w:right w:type="dxa" w:w="100"/>
             </w:tcMar>
           </w:tcPr>
           <w:p>
@@ -1419,10 +1517,10 @@
               <w:right w:val="single" w:color="A6A6A6" w:sz="4"/>
             </w:tcBorders>
             <w:tcMar>
-              <w:top w:type="dxa" w:w="30"/>
-              <w:left w:type="dxa" w:w="90"/>
-              <w:bottom w:type="dxa" w:w="30"/>
-              <w:right w:type="dxa" w:w="90"/>
+              <w:top w:type="dxa" w:w="50"/>
+              <w:left w:type="dxa" w:w="100"/>
+              <w:bottom w:type="dxa" w:w="50"/>
+              <w:right w:type="dxa" w:w="100"/>
             </w:tcMar>
           </w:tcPr>
           <w:p>
@@ -1449,10 +1547,10 @@
               <w:right w:val="single" w:color="A6A6A6" w:sz="4"/>
             </w:tcBorders>
             <w:tcMar>
-              <w:top w:type="dxa" w:w="30"/>
-              <w:left w:type="dxa" w:w="90"/>
-              <w:bottom w:type="dxa" w:w="30"/>
-              <w:right w:type="dxa" w:w="90"/>
+              <w:top w:type="dxa" w:w="50"/>
+              <w:left w:type="dxa" w:w="100"/>
+              <w:bottom w:type="dxa" w:w="50"/>
+              <w:right w:type="dxa" w:w="100"/>
             </w:tcMar>
           </w:tcPr>
           <w:p>
@@ -1479,10 +1577,10 @@
               <w:right w:val="single" w:color="A6A6A6" w:sz="4"/>
             </w:tcBorders>
             <w:tcMar>
-              <w:top w:type="dxa" w:w="30"/>
-              <w:left w:type="dxa" w:w="90"/>
-              <w:bottom w:type="dxa" w:w="30"/>
-              <w:right w:type="dxa" w:w="90"/>
+              <w:top w:type="dxa" w:w="50"/>
+              <w:left w:type="dxa" w:w="100"/>
+              <w:bottom w:type="dxa" w:w="50"/>
+              <w:right w:type="dxa" w:w="100"/>
             </w:tcMar>
           </w:tcPr>
           <w:p>
@@ -1503,33 +1601,35 @@
     </w:tbl>
     <w:p>
       <w:pPr>
-        <w:spacing w:after="90" w:before="100" w:line="259"/>
-      </w:pPr>
-      <w:r>
-        <w:t xml:space="preserve">La primera mesura és la més lenta, probablement perquè era el primer cop que el servidor DHCP veia el node. A les altres li va donar la mateixa IP i la connexió va ser més ràpida: sense la primera, 868 ± 248 ms. Sempre va connectar al primer intent, amb un RSSI entre −57 i −71 dBm.</w:t>
+        <w:spacing w:after="140" w:before="140" w:line="276"/>
+      </w:pPr>
+      <w:r>
+        <w:t xml:space="preserve">La primera mesura és la més lenta, probablement perquè era el primer cop que el DHCP veia el node. Amb la clau incorrecta torna a SENSE CREDENCIALS sense desar res, i després d'un reinici amb les credencials bones es connecta sol, sense passar per BLE.</w:t>
       </w:r>
     </w:p>
     <w:p>
       <w:pPr>
         <w:keepNext/>
-        <w:spacing w:after="80" w:before="200"/>
+        <w:spacing w:after="140" w:before="320"/>
       </w:pPr>
       <w:r>
         <w:rPr>
           <w:b/>
           <w:bCs/>
-          <w:sz w:val="25"/>
-          <w:szCs w:val="25"/>
+          <w:color w:val="1F3864"/>
+          <w:sz w:val="26"/>
+          <w:szCs w:val="26"/>
         </w:rPr>
         <w:t xml:space="preserve">4. Restabliment de fàbrica (exercici 3)</w:t>
       </w:r>
     </w:p>
     <w:p>
       <w:pPr>
-        <w:spacing w:after="90" w:line="259"/>
-      </w:pPr>
-      <w:r>
-        <w:t xml:space="preserve">El polsador es llegeix amb un filtre antirebots de 30 ms i, perquè no es dispari per accident, només compta si s'ha deixat anar alguna vegada des de l'arrencada. A partir del tercer segon la pantalla es posa vermella amb «RESET?», un compte enrere i una barra, i el LED fa pampallugues a 10 Hz. Als 5 s el node publica RESTABLINT a la característica estat, esborra l'espai de noms </w:t>
+        <w:keepNext/>
+        <w:spacing w:after="140" w:line="276"/>
+      </w:pPr>
+      <w:r>
+        <w:t xml:space="preserve">Si es manté premut el polsador, a partir del tercer segon la pantalla es posa vermella amb un compte enrere i el LED fa pampallugues a 10 Hz. Als 5 s el node esborra l'espai de noms </w:t>
       </w:r>
       <w:r>
         <w:rPr>
@@ -1540,53 +1640,13 @@
         <w:t xml:space="preserve">wifi</w:t>
       </w:r>
       <w:r>
-        <w:t xml:space="preserve"> i es reinicia. Mentre el polsador està premut no s'envia cap POST, perquè un POST pot bloquejar el programa fins a 2 s.</w:t>
-      </w:r>
-    </w:p>
-    <w:p>
-      <w:pPr>
-        <w:pStyle w:val="ListParagraph"/>
-        <w:numPr>
-          <w:ilvl w:val="0"/>
-          <w:numId w:val="2"/>
-        </w:numPr>
-        <w:spacing w:after="50" w:line="259"/>
-      </w:pPr>
-      <w:r>
-        <w:rPr>
-          <w:b/>
-          <w:bCs/>
-        </w:rPr>
-        <w:t xml:space="preserve">Més de 5 s:</w:t>
-      </w:r>
-      <w:r>
-        <w:t xml:space="preserve"> ESBORRANT, reinici, «NVS buida» i SENSE CREDENCIALS (figura 2). Després el mòbil torna a veure el servei anunciat i el node accepta credencials noves.</w:t>
-      </w:r>
-    </w:p>
-    <w:p>
-      <w:pPr>
-        <w:pStyle w:val="ListParagraph"/>
-        <w:numPr>
-          <w:ilvl w:val="0"/>
-          <w:numId w:val="2"/>
-        </w:numPr>
-        <w:spacing w:after="50" w:line="259"/>
-      </w:pPr>
-      <w:r>
-        <w:rPr>
-          <w:b/>
-          <w:bCs/>
-        </w:rPr>
-        <w:t xml:space="preserve">Deixar-lo anar als 4,1 s:</w:t>
-      </w:r>
-      <w:r>
-        <w:t xml:space="preserve"> «Boto deixat anar als 4.1 s: cancel.lat, no passa res», i el node continua en OPERATIU.</w:t>
+        <w:t xml:space="preserve"> de la NVS i es reinicia (figura 5).</w:t>
       </w:r>
     </w:p>
     <w:p>
       <w:pPr>
         <w:keepNext/>
-        <w:spacing w:after="0" w:before="80"/>
+        <w:spacing w:after="0" w:before="100"/>
         <w:jc w:val="center"/>
       </w:pPr>
       <w:r>
@@ -1608,7 +1668,7 @@
                     </pic:cNvPicPr>
                   </pic:nvPicPr>
                   <pic:blipFill>
-                    <a:blip r:embed="rId9" cstate="none"/>
+                    <a:blip r:embed="rId12" cstate="none"/>
                     <a:srcRect/>
                     <a:stretch>
                       <a:fillRect/>
@@ -1632,53 +1692,64 @@
     </w:p>
     <w:p>
       <w:pPr>
-        <w:spacing w:after="140" w:before="40"/>
+        <w:spacing w:after="220" w:before="60"/>
         <w:jc w:val="center"/>
       </w:pPr>
       <w:r>
         <w:rPr>
           <w:i/>
           <w:iCs/>
+          <w:color w:val="404040"/>
           <w:sz w:val="18"/>
           <w:szCs w:val="18"/>
         </w:rPr>
-        <w:t xml:space="preserve">Figura 2. Restabliment: OPERATIU; avís a 3,1 s i a 4,2 s; ESBORRANT als 5 s; SENSE CREDENCIALS després del reinici.</w:t>
+        <w:t xml:space="preserve">Figura 5. OPERATIU → avís a 3,1 s i a 4,2 s → ESBORRANT als 5 s → SENSE CREDENCIALS després del reinici.</w:t>
+      </w:r>
+    </w:p>
+    <w:p>
+      <w:pPr>
+        <w:spacing w:after="140" w:line="276"/>
+      </w:pPr>
+      <w:r>
+        <w:t xml:space="preserve">Si es deixa anar als 4,1 s no passa res («cancel.lat, no passa res») i el node continua en OPERATIU. Després del restabliment es torna a anunciar i accepta credencials noves.</w:t>
       </w:r>
     </w:p>
     <w:p>
       <w:pPr>
         <w:keepNext/>
-        <w:spacing w:after="80" w:before="200"/>
+        <w:spacing w:after="140" w:before="320"/>
       </w:pPr>
       <w:r>
         <w:rPr>
           <w:b/>
           <w:bCs/>
-          <w:sz w:val="25"/>
-          <w:szCs w:val="25"/>
+          <w:color w:val="1F3864"/>
+          <w:sz w:val="26"/>
+          <w:szCs w:val="26"/>
         </w:rPr>
         <w:t xml:space="preserve">5. Temperatura per BLE (exercici 4)</w:t>
       </w:r>
     </w:p>
     <w:p>
       <w:pPr>
-        <w:spacing w:after="90" w:line="259"/>
-      </w:pPr>
-      <w:r>
-        <w:t xml:space="preserve">El DHT22 es llegeix cada 2 s i la característica temperatura guarda l'última lectura amb un decimal (per exemple, 27.8). Només es notifica si hi ha un mòbil connectat que té activat el 2902 i el valor ha canviat com a mínim una dècima respecte de l'últim enviat. Es comparen dècimes enteres per evitar errors d'arrodoniment. El port sèrie compta les notificacions de cada minut, però la mesura no s'ha pogut fer pel problema del 2902 de l'apartat 2. Al començament, el DHT22 donava lectures fallides o 0,0 °C i 0,0 % fins que es va prémer bé contra la protoboard: era un mal contacte, com a la P1.</w:t>
+        <w:spacing w:after="140" w:line="276"/>
+      </w:pPr>
+      <w:r>
+        <w:t xml:space="preserve">El DHT22 es llegeix cada 2 s. La característica temperatura dona l'última lectura amb un decimal i la notifica només si hi ha un mòbil subscrit i el valor ha canviat com a mínim 0,1 °C. La mesura de notificacions per minut no s'ha pogut fer perquè el mòbil no activava el 2902.</w:t>
       </w:r>
     </w:p>
     <w:p>
       <w:pPr>
         <w:keepNext/>
-        <w:spacing w:after="80" w:before="200"/>
+        <w:spacing w:after="140" w:before="320"/>
       </w:pPr>
       <w:r>
         <w:rPr>
           <w:b/>
           <w:bCs/>
-          <w:sz w:val="25"/>
-          <w:szCs w:val="25"/>
+          <w:color w:val="1F3864"/>
+          <w:sz w:val="26"/>
+          <w:szCs w:val="26"/>
         </w:rPr>
         <w:t xml:space="preserve">6. Telemetria REST (exercici 5)</w:t>
       </w:r>
@@ -1686,48 +1757,69 @@
     <w:p>
       <w:pPr>
         <w:keepNext/>
-        <w:spacing w:after="90" w:line="259"/>
-      </w:pPr>
-      <w:r>
-        <w:t xml:space="preserve">Al Node-RED, un node http in rep </w:t>
-      </w:r>
-      <w:r>
-        <w:rPr>
-          <w:rFonts w:ascii="Consolas" w:cs="Consolas" w:eastAsia="Consolas" w:hAnsi="Consolas"/>
+        <w:spacing w:after="0" w:before="100"/>
+        <w:jc w:val="center"/>
+      </w:pPr>
+      <w:r>
+        <w:drawing>
+          <wp:inline distT="0" distB="0" distL="0" distR="0">
+            <wp:extent cx="5715000" cy="561975"/>
+            <wp:effectExtent t="0" r="0" b="0" l="0"/>
+            <wp:docPr id="1" name="Flux de Node-RED" descr="Flux de Node-RED" title="Flux de Node-RED"/>
+            <wp:cNvGraphicFramePr>
+              <a:graphicFrameLocks xmlns:a="http://schemas.openxmlformats.org/drawingml/2006/main" noChangeAspect="1"/>
+            </wp:cNvGraphicFramePr>
+            <a:graphic xmlns:a="http://schemas.openxmlformats.org/drawingml/2006/main">
+              <a:graphicData uri="http://schemas.openxmlformats.org/drawingml/2006/picture">
+                <pic:pic xmlns:pic="http://schemas.openxmlformats.org/drawingml/2006/picture">
+                  <pic:nvPicPr>
+                    <pic:cNvPr id="0" name="" descr=""/>
+                    <pic:cNvPicPr>
+                      <a:picLocks noChangeAspect="1" noChangeArrowheads="1"/>
+                    </pic:cNvPicPr>
+                  </pic:nvPicPr>
+                  <pic:blipFill>
+                    <a:blip r:embed="rId13" cstate="none"/>
+                    <a:srcRect/>
+                    <a:stretch>
+                      <a:fillRect/>
+                    </a:stretch>
+                  </pic:blipFill>
+                  <pic:spPr bwMode="auto">
+                    <a:xfrm>
+                      <a:off x="0" y="0"/>
+                      <a:ext cx="5715000" cy="561975"/>
+                    </a:xfrm>
+                    <a:prstGeom prst="rect">
+                      <a:avLst/>
+                    </a:prstGeom>
+                  </pic:spPr>
+                </pic:pic>
+              </a:graphicData>
+            </a:graphic>
+          </wp:inline>
+        </w:drawing>
+      </w:r>
+    </w:p>
+    <w:p>
+      <w:pPr>
+        <w:spacing w:after="220" w:before="60"/>
+        <w:jc w:val="center"/>
+      </w:pPr>
+      <w:r>
+        <w:rPr>
+          <w:i/>
+          <w:iCs/>
+          <w:color w:val="404040"/>
           <w:sz w:val="18"/>
           <w:szCs w:val="18"/>
         </w:rPr>
-        <w:t xml:space="preserve">POST /api/telemetria</w:t>
-      </w:r>
-      <w:r>
-        <w:t xml:space="preserve"> sense processar el cos, per poder respondre 400 si el JSON està mal escrit. Una funció comprova els camps i que la temperatura sigui entre −40 i 80 °C (el rang del DHT22), hi afegeix la marca de temps </w:t>
-      </w:r>
-      <w:r>
-        <w:rPr>
-          <w:rFonts w:ascii="Consolas" w:cs="Consolas" w:eastAsia="Consolas" w:hAnsi="Consolas"/>
-          <w:sz w:val="18"/>
-          <w:szCs w:val="18"/>
-        </w:rPr>
-        <w:t xml:space="preserve">rebut</w:t>
-      </w:r>
-      <w:r>
-        <w:t xml:space="preserve"> en ISO 8601, i un node file desa la mostra com una línia nova a </w:t>
-      </w:r>
-      <w:r>
-        <w:rPr>
-          <w:rFonts w:ascii="Consolas" w:cs="Consolas" w:eastAsia="Consolas" w:hAnsi="Consolas"/>
-          <w:sz w:val="18"/>
-          <w:szCs w:val="18"/>
-        </w:rPr>
-        <w:t xml:space="preserve">/home/pau/dades/telemetria.jsonl</w:t>
-      </w:r>
-      <w:r>
-        <w:t xml:space="preserve">. L'usuari del Raspberry és pau, i per això el fitxer no és a /home/pi. Proves amb curl des del portàtil:</w:t>
+        <w:t xml:space="preserve">Figura 6. Flux de Node-RED. El fitxer és a /home/pau/dades perquè l'usuari del Raspberry és pau.</w:t>
       </w:r>
     </w:p>
     <w:tbl>
       <w:tblPr>
-        <w:tblW w:type="dxa" w:w="9300"/>
+        <w:tblW w:type="dxa" w:w="8800"/>
         <w:jc w:val="center"/>
         <w:tblBorders>
           <w:top w:val="single" w:color="auto" w:sz="4"/>
@@ -1739,8 +1831,8 @@
         </w:tblBorders>
       </w:tblPr>
       <w:tblGrid>
-        <w:gridCol w:w="2300"/>
-        <w:gridCol w:w="7000"/>
+        <w:gridCol w:w="2600"/>
+        <w:gridCol w:w="6200"/>
       </w:tblGrid>
       <w:tr>
         <w:trPr>
@@ -1748,7 +1840,7 @@
         </w:trPr>
         <w:tc>
           <w:tcPr>
-            <w:tcW w:type="dxa" w:w="2300"/>
+            <w:tcW w:type="dxa" w:w="2600"/>
             <w:tcBorders>
               <w:top w:val="single" w:color="A6A6A6" w:sz="4"/>
               <w:left w:val="single" w:color="A6A6A6" w:sz="4"/>
@@ -1757,10 +1849,10 @@
             </w:tcBorders>
             <w:shd w:fill="E7E6E6" w:color="auto" w:val="clear"/>
             <w:tcMar>
-              <w:top w:type="dxa" w:w="30"/>
-              <w:left w:type="dxa" w:w="90"/>
-              <w:bottom w:type="dxa" w:w="30"/>
-              <w:right w:type="dxa" w:w="90"/>
+              <w:top w:type="dxa" w:w="50"/>
+              <w:left w:type="dxa" w:w="100"/>
+              <w:bottom w:type="dxa" w:w="50"/>
+              <w:right w:type="dxa" w:w="100"/>
             </w:tcMar>
           </w:tcPr>
           <w:p>
@@ -1775,13 +1867,13 @@
                 <w:sz w:val="19"/>
                 <w:szCs w:val="19"/>
               </w:rPr>
-              <w:t xml:space="preserve">Petició</w:t>
-            </w:r>
-          </w:p>
-        </w:tc>
-        <w:tc>
-          <w:tcPr>
-            <w:tcW w:type="dxa" w:w="7000"/>
+              <w:t xml:space="preserve">Prova amb curl</w:t>
+            </w:r>
+          </w:p>
+        </w:tc>
+        <w:tc>
+          <w:tcPr>
+            <w:tcW w:type="dxa" w:w="6200"/>
             <w:tcBorders>
               <w:top w:val="single" w:color="A6A6A6" w:sz="4"/>
               <w:left w:val="single" w:color="A6A6A6" w:sz="4"/>
@@ -1790,10 +1882,10 @@
             </w:tcBorders>
             <w:shd w:fill="E7E6E6" w:color="auto" w:val="clear"/>
             <w:tcMar>
-              <w:top w:type="dxa" w:w="30"/>
-              <w:left w:type="dxa" w:w="90"/>
-              <w:bottom w:type="dxa" w:w="30"/>
-              <w:right w:type="dxa" w:w="90"/>
+              <w:top w:type="dxa" w:w="50"/>
+              <w:left w:type="dxa" w:w="100"/>
+              <w:bottom w:type="dxa" w:w="50"/>
+              <w:right w:type="dxa" w:w="100"/>
             </w:tcMar>
           </w:tcPr>
           <w:p>
@@ -1819,18 +1911,18 @@
         </w:trPr>
         <w:tc>
           <w:tcPr>
-            <w:tcW w:type="dxa" w:w="2300"/>
-            <w:tcBorders>
-              <w:top w:val="single" w:color="A6A6A6" w:sz="4"/>
-              <w:left w:val="single" w:color="A6A6A6" w:sz="4"/>
-              <w:bottom w:val="single" w:color="A6A6A6" w:sz="4"/>
-              <w:right w:val="single" w:color="A6A6A6" w:sz="4"/>
-            </w:tcBorders>
-            <w:tcMar>
-              <w:top w:type="dxa" w:w="30"/>
-              <w:left w:type="dxa" w:w="90"/>
-              <w:bottom w:type="dxa" w:w="30"/>
-              <w:right w:type="dxa" w:w="90"/>
+            <w:tcW w:type="dxa" w:w="2600"/>
+            <w:tcBorders>
+              <w:top w:val="single" w:color="A6A6A6" w:sz="4"/>
+              <w:left w:val="single" w:color="A6A6A6" w:sz="4"/>
+              <w:bottom w:val="single" w:color="A6A6A6" w:sz="4"/>
+              <w:right w:val="single" w:color="A6A6A6" w:sz="4"/>
+            </w:tcBorders>
+            <w:tcMar>
+              <w:top w:type="dxa" w:w="50"/>
+              <w:left w:type="dxa" w:w="100"/>
+              <w:bottom w:type="dxa" w:w="50"/>
+              <w:right w:type="dxa" w:w="100"/>
             </w:tcMar>
           </w:tcPr>
           <w:p>
@@ -1849,18 +1941,18 @@
         </w:tc>
         <w:tc>
           <w:tcPr>
-            <w:tcW w:type="dxa" w:w="7000"/>
-            <w:tcBorders>
-              <w:top w:val="single" w:color="A6A6A6" w:sz="4"/>
-              <w:left w:val="single" w:color="A6A6A6" w:sz="4"/>
-              <w:bottom w:val="single" w:color="A6A6A6" w:sz="4"/>
-              <w:right w:val="single" w:color="A6A6A6" w:sz="4"/>
-            </w:tcBorders>
-            <w:tcMar>
-              <w:top w:type="dxa" w:w="30"/>
-              <w:left w:type="dxa" w:w="90"/>
-              <w:bottom w:type="dxa" w:w="30"/>
-              <w:right w:type="dxa" w:w="90"/>
+            <w:tcW w:type="dxa" w:w="6200"/>
+            <w:tcBorders>
+              <w:top w:val="single" w:color="A6A6A6" w:sz="4"/>
+              <w:left w:val="single" w:color="A6A6A6" w:sz="4"/>
+              <w:bottom w:val="single" w:color="A6A6A6" w:sz="4"/>
+              <w:right w:val="single" w:color="A6A6A6" w:sz="4"/>
+            </w:tcBorders>
+            <w:tcMar>
+              <w:top w:type="dxa" w:w="50"/>
+              <w:left w:type="dxa" w:w="100"/>
+              <w:bottom w:type="dxa" w:w="50"/>
+              <w:right w:type="dxa" w:w="100"/>
             </w:tcMar>
           </w:tcPr>
           <w:p>
@@ -1892,18 +1984,18 @@
         </w:trPr>
         <w:tc>
           <w:tcPr>
-            <w:tcW w:type="dxa" w:w="2300"/>
-            <w:tcBorders>
-              <w:top w:val="single" w:color="A6A6A6" w:sz="4"/>
-              <w:left w:val="single" w:color="A6A6A6" w:sz="4"/>
-              <w:bottom w:val="single" w:color="A6A6A6" w:sz="4"/>
-              <w:right w:val="single" w:color="A6A6A6" w:sz="4"/>
-            </w:tcBorders>
-            <w:tcMar>
-              <w:top w:type="dxa" w:w="30"/>
-              <w:left w:type="dxa" w:w="90"/>
-              <w:bottom w:type="dxa" w:w="30"/>
-              <w:right w:type="dxa" w:w="90"/>
+            <w:tcW w:type="dxa" w:w="2600"/>
+            <w:tcBorders>
+              <w:top w:val="single" w:color="A6A6A6" w:sz="4"/>
+              <w:left w:val="single" w:color="A6A6A6" w:sz="4"/>
+              <w:bottom w:val="single" w:color="A6A6A6" w:sz="4"/>
+              <w:right w:val="single" w:color="A6A6A6" w:sz="4"/>
+            </w:tcBorders>
+            <w:tcMar>
+              <w:top w:type="dxa" w:w="50"/>
+              <w:left w:type="dxa" w:w="100"/>
+              <w:bottom w:type="dxa" w:w="50"/>
+              <w:right w:type="dxa" w:w="100"/>
             </w:tcMar>
           </w:tcPr>
           <w:p>
@@ -1922,18 +2014,18 @@
         </w:tc>
         <w:tc>
           <w:tcPr>
-            <w:tcW w:type="dxa" w:w="7000"/>
-            <w:tcBorders>
-              <w:top w:val="single" w:color="A6A6A6" w:sz="4"/>
-              <w:left w:val="single" w:color="A6A6A6" w:sz="4"/>
-              <w:bottom w:val="single" w:color="A6A6A6" w:sz="4"/>
-              <w:right w:val="single" w:color="A6A6A6" w:sz="4"/>
-            </w:tcBorders>
-            <w:tcMar>
-              <w:top w:type="dxa" w:w="30"/>
-              <w:left w:type="dxa" w:w="90"/>
-              <w:bottom w:type="dxa" w:w="30"/>
-              <w:right w:type="dxa" w:w="90"/>
+            <w:tcW w:type="dxa" w:w="6200"/>
+            <w:tcBorders>
+              <w:top w:val="single" w:color="A6A6A6" w:sz="4"/>
+              <w:left w:val="single" w:color="A6A6A6" w:sz="4"/>
+              <w:bottom w:val="single" w:color="A6A6A6" w:sz="4"/>
+              <w:right w:val="single" w:color="A6A6A6" w:sz="4"/>
+            </w:tcBorders>
+            <w:tcMar>
+              <w:top w:type="dxa" w:w="50"/>
+              <w:left w:type="dxa" w:w="100"/>
+              <w:bottom w:type="dxa" w:w="50"/>
+              <w:right w:type="dxa" w:w="100"/>
             </w:tcMar>
           </w:tcPr>
           <w:p>
@@ -1965,18 +2057,18 @@
         </w:trPr>
         <w:tc>
           <w:tcPr>
-            <w:tcW w:type="dxa" w:w="2300"/>
-            <w:tcBorders>
-              <w:top w:val="single" w:color="A6A6A6" w:sz="4"/>
-              <w:left w:val="single" w:color="A6A6A6" w:sz="4"/>
-              <w:bottom w:val="single" w:color="A6A6A6" w:sz="4"/>
-              <w:right w:val="single" w:color="A6A6A6" w:sz="4"/>
-            </w:tcBorders>
-            <w:tcMar>
-              <w:top w:type="dxa" w:w="30"/>
-              <w:left w:type="dxa" w:w="90"/>
-              <w:bottom w:type="dxa" w:w="30"/>
-              <w:right w:type="dxa" w:w="90"/>
+            <w:tcW w:type="dxa" w:w="2600"/>
+            <w:tcBorders>
+              <w:top w:val="single" w:color="A6A6A6" w:sz="4"/>
+              <w:left w:val="single" w:color="A6A6A6" w:sz="4"/>
+              <w:bottom w:val="single" w:color="A6A6A6" w:sz="4"/>
+              <w:right w:val="single" w:color="A6A6A6" w:sz="4"/>
+            </w:tcBorders>
+            <w:tcMar>
+              <w:top w:type="dxa" w:w="50"/>
+              <w:left w:type="dxa" w:w="100"/>
+              <w:bottom w:type="dxa" w:w="50"/>
+              <w:right w:type="dxa" w:w="100"/>
             </w:tcMar>
           </w:tcPr>
           <w:p>
@@ -1995,18 +2087,18 @@
         </w:tc>
         <w:tc>
           <w:tcPr>
-            <w:tcW w:type="dxa" w:w="7000"/>
-            <w:tcBorders>
-              <w:top w:val="single" w:color="A6A6A6" w:sz="4"/>
-              <w:left w:val="single" w:color="A6A6A6" w:sz="4"/>
-              <w:bottom w:val="single" w:color="A6A6A6" w:sz="4"/>
-              <w:right w:val="single" w:color="A6A6A6" w:sz="4"/>
-            </w:tcBorders>
-            <w:tcMar>
-              <w:top w:type="dxa" w:w="30"/>
-              <w:left w:type="dxa" w:w="90"/>
-              <w:bottom w:type="dxa" w:w="30"/>
-              <w:right w:type="dxa" w:w="90"/>
+            <w:tcW w:type="dxa" w:w="6200"/>
+            <w:tcBorders>
+              <w:top w:val="single" w:color="A6A6A6" w:sz="4"/>
+              <w:left w:val="single" w:color="A6A6A6" w:sz="4"/>
+              <w:bottom w:val="single" w:color="A6A6A6" w:sz="4"/>
+              <w:right w:val="single" w:color="A6A6A6" w:sz="4"/>
+            </w:tcBorders>
+            <w:tcMar>
+              <w:top w:type="dxa" w:w="50"/>
+              <w:left w:type="dxa" w:w="100"/>
+              <w:bottom w:type="dxa" w:w="50"/>
+              <w:right w:type="dxa" w:w="100"/>
             </w:tcMar>
           </w:tcPr>
           <w:p>
@@ -2027,7 +2119,7 @@
                 <w:sz w:val="19"/>
                 <w:szCs w:val="19"/>
               </w:rPr>
-              <w:t xml:space="preserve">{"error":"Falten camps","falten":["humitat","rssi","temps_activitat"]}</w:t>
+              <w:t xml:space="preserve">{"error":"Falten camps","falten":[…]}</w:t>
             </w:r>
           </w:p>
         </w:tc>
@@ -2038,18 +2130,18 @@
         </w:trPr>
         <w:tc>
           <w:tcPr>
-            <w:tcW w:type="dxa" w:w="2300"/>
-            <w:tcBorders>
-              <w:top w:val="single" w:color="A6A6A6" w:sz="4"/>
-              <w:left w:val="single" w:color="A6A6A6" w:sz="4"/>
-              <w:bottom w:val="single" w:color="A6A6A6" w:sz="4"/>
-              <w:right w:val="single" w:color="A6A6A6" w:sz="4"/>
-            </w:tcBorders>
-            <w:tcMar>
-              <w:top w:type="dxa" w:w="30"/>
-              <w:left w:type="dxa" w:w="90"/>
-              <w:bottom w:type="dxa" w:w="30"/>
-              <w:right w:type="dxa" w:w="90"/>
+            <w:tcW w:type="dxa" w:w="2600"/>
+            <w:tcBorders>
+              <w:top w:val="single" w:color="A6A6A6" w:sz="4"/>
+              <w:left w:val="single" w:color="A6A6A6" w:sz="4"/>
+              <w:bottom w:val="single" w:color="A6A6A6" w:sz="4"/>
+              <w:right w:val="single" w:color="A6A6A6" w:sz="4"/>
+            </w:tcBorders>
+            <w:tcMar>
+              <w:top w:type="dxa" w:w="50"/>
+              <w:left w:type="dxa" w:w="100"/>
+              <w:bottom w:type="dxa" w:w="50"/>
+              <w:right w:type="dxa" w:w="100"/>
             </w:tcMar>
           </w:tcPr>
           <w:p>
@@ -2068,18 +2160,18 @@
         </w:tc>
         <w:tc>
           <w:tcPr>
-            <w:tcW w:type="dxa" w:w="7000"/>
-            <w:tcBorders>
-              <w:top w:val="single" w:color="A6A6A6" w:sz="4"/>
-              <w:left w:val="single" w:color="A6A6A6" w:sz="4"/>
-              <w:bottom w:val="single" w:color="A6A6A6" w:sz="4"/>
-              <w:right w:val="single" w:color="A6A6A6" w:sz="4"/>
-            </w:tcBorders>
-            <w:tcMar>
-              <w:top w:type="dxa" w:w="30"/>
-              <w:left w:type="dxa" w:w="90"/>
-              <w:bottom w:type="dxa" w:w="30"/>
-              <w:right w:type="dxa" w:w="90"/>
+            <w:tcW w:type="dxa" w:w="6200"/>
+            <w:tcBorders>
+              <w:top w:val="single" w:color="A6A6A6" w:sz="4"/>
+              <w:left w:val="single" w:color="A6A6A6" w:sz="4"/>
+              <w:bottom w:val="single" w:color="A6A6A6" w:sz="4"/>
+              <w:right w:val="single" w:color="A6A6A6" w:sz="4"/>
+            </w:tcBorders>
+            <w:tcMar>
+              <w:top w:type="dxa" w:w="50"/>
+              <w:left w:type="dxa" w:w="100"/>
+              <w:bottom w:type="dxa" w:w="50"/>
+              <w:right w:type="dxa" w:w="100"/>
             </w:tcMar>
           </w:tcPr>
           <w:p>
@@ -2100,7 +2192,7 @@
                 <w:sz w:val="19"/>
                 <w:szCs w:val="19"/>
               </w:rPr>
-              <w:t xml:space="preserve">{"error":"Temperatura fora de rang","temperatura":150}</w:t>
+              <w:t xml:space="preserve">{"error":"Temperatura fora de rang"}</w:t>
             </w:r>
           </w:p>
         </w:tc>
@@ -2108,10 +2200,10 @@
     </w:tbl>
     <w:p>
       <w:pPr>
-        <w:spacing w:after="90" w:before="100" w:line="259"/>
-      </w:pPr>
-      <w:r>
-        <w:t xml:space="preserve">Només les mostres amb 201 arriben al fitxer. En OPERATIU, l'ESP32 envia un POST cada 10 s, per exemple </w:t>
+        <w:spacing w:after="140" w:before="160" w:line="276"/>
+      </w:pPr>
+      <w:r>
+        <w:t xml:space="preserve">En OPERATIU, l'ESP32 envia un POST cada 10 s amb </w:t>
       </w:r>
       <w:r>
         <w:rPr>
@@ -2119,10 +2211,10 @@
           <w:sz w:val="18"/>
           <w:szCs w:val="18"/>
         </w:rPr>
-        <w:t xml:space="preserve">{"id":"Node-Pau","temperatura":27.8,"humitat":49.3,"rssi":-60,"temps_activitat":509}</w:t>
-      </w:r>
-      <w:r>
-        <w:t xml:space="preserve">. Registra el codi i el temps de resposta, que ha estat de 35 a 210 ms, i compta els enviaments correctes i els fallits. Si el sensor no té dada, envia </w:t>
+        <w:t xml:space="preserve">id</w:t>
+      </w:r>
+      <w:r>
+        <w:t xml:space="preserve">, </w:t>
       </w:r>
       <w:r>
         <w:rPr>
@@ -2130,10 +2222,10 @@
           <w:sz w:val="18"/>
           <w:szCs w:val="18"/>
         </w:rPr>
-        <w:t xml:space="preserve">null</w:t>
-      </w:r>
-      <w:r>
-        <w:t xml:space="preserve"> i el Node-RED respon 422, que també compta com a fallit. Amb </w:t>
+        <w:t xml:space="preserve">temperatura</w:t>
+      </w:r>
+      <w:r>
+        <w:t xml:space="preserve">, </w:t>
       </w:r>
       <w:r>
         <w:rPr>
@@ -2141,18 +2233,10 @@
           <w:sz w:val="18"/>
           <w:szCs w:val="18"/>
         </w:rPr>
-        <w:t xml:space="preserve">tail -f</w:t>
-      </w:r>
-      <w:r>
-        <w:t xml:space="preserve"> al Raspberry es veu arribar una línia cada 10 s.</w:t>
-      </w:r>
-    </w:p>
-    <w:p>
-      <w:pPr>
-        <w:spacing w:after="90" w:line="259"/>
-      </w:pPr>
-      <w:r>
-        <w:t xml:space="preserve">La IP del Raspberry la dona el DHCP i canvia d'un dia per l'altre (10.11.0.47 el 05/10 i 10.11.1.11 el 07/10), i el nom raspberrypi.local no es resolia des del portàtil. Per això la IP no és fixa al codi: es canvia des del port sèrie amb l'ordre </w:t>
+        <w:t xml:space="preserve">humitat</w:t>
+      </w:r>
+      <w:r>
+        <w:t xml:space="preserve">, </w:t>
       </w:r>
       <w:r>
         <w:rPr>
@@ -2160,26 +2244,10 @@
           <w:sz w:val="18"/>
           <w:szCs w:val="18"/>
         </w:rPr>
-        <w:t xml:space="preserve">servidor &lt;ip&gt;</w:t>
-      </w:r>
-      <w:r>
-        <w:t xml:space="preserve"> i es desa a la NVS, sense haver de recompilar.</w:t>
-      </w:r>
-    </w:p>
-    <w:p>
-      <w:pPr>
-        <w:keepNext/>
-        <w:spacing w:after="90" w:line="259"/>
-      </w:pPr>
-      <w:r>
-        <w:rPr>
-          <w:b/>
-          <w:bCs/>
-        </w:rPr>
-        <w:t xml:space="preserve">Desconnexió del Raspberry durant 60 s</w:t>
-      </w:r>
-      <w:r>
-        <w:t xml:space="preserve"> (</w:t>
+        <w:t xml:space="preserve">rssi</w:t>
+      </w:r>
+      <w:r>
+        <w:t xml:space="preserve"> i </w:t>
       </w:r>
       <w:r>
         <w:rPr>
@@ -2187,10 +2255,34 @@
           <w:sz w:val="18"/>
           <w:szCs w:val="18"/>
         </w:rPr>
-        <w:t xml:space="preserve">rfkill block wifi; sleep 60; rfkill unblock wifi</w:t>
-      </w:r>
-      <w:r>
-        <w:t xml:space="preserve">). Port sèrie del node i fitxer del Raspberry:</w:t>
+        <w:t xml:space="preserve">temps_activitat</w:t>
+      </w:r>
+      <w:r>
+        <w:t xml:space="preserve">, registra el codi rebut i compta els enviaments fallits. La IP del Raspberry la dona el DHCP i canvia cada dia, i per això es pot canviar des del port sèrie amb l'ordre </w:t>
+      </w:r>
+      <w:r>
+        <w:rPr>
+          <w:rFonts w:ascii="Consolas" w:cs="Consolas" w:eastAsia="Consolas" w:hAnsi="Consolas"/>
+          <w:sz w:val="18"/>
+          <w:szCs w:val="18"/>
+        </w:rPr>
+        <w:t xml:space="preserve">servidor &lt;ip&gt;</w:t>
+      </w:r>
+      <w:r>
+        <w:t xml:space="preserve">.</w:t>
+      </w:r>
+    </w:p>
+    <w:p>
+      <w:pPr>
+        <w:keepNext/>
+        <w:spacing w:after="40" w:line="276"/>
+      </w:pPr>
+      <w:r>
+        <w:rPr>
+          <w:b/>
+          <w:bCs/>
+        </w:rPr>
+        <w:t xml:space="preserve">Raspberry desconnectat durant 60 s:</w:t>
       </w:r>
     </w:p>
     <w:p>
@@ -2198,7 +2290,7 @@
         <w:keepNext/>
         <w:keepLines/>
         <w:shd w:fill="F2F2F2" w:color="auto" w:val="clear"/>
-        <w:spacing w:after="0" w:before="60" w:line="240"/>
+        <w:spacing w:after="0" w:before="60" w:line="250"/>
         <w:ind w:left="120" w:right="120"/>
       </w:pPr>
       <w:r>
@@ -2217,7 +2309,7 @@
         <w:keepNext/>
         <w:keepLines/>
         <w:shd w:fill="F2F2F2" w:color="auto" w:val="clear"/>
-        <w:spacing w:after="0" w:before="0" w:line="240"/>
+        <w:spacing w:after="0" w:before="0" w:line="250"/>
         <w:ind w:left="120" w:right="120"/>
       </w:pPr>
       <w:r>
@@ -2236,7 +2328,7 @@
         <w:keepNext/>
         <w:keepLines/>
         <w:shd w:fill="F2F2F2" w:color="auto" w:val="clear"/>
-        <w:spacing w:after="0" w:before="0" w:line="240"/>
+        <w:spacing w:after="0" w:before="0" w:line="250"/>
         <w:ind w:left="120" w:right="120"/>
       </w:pPr>
       <w:r>
@@ -2247,15 +2339,15 @@
           <w:sz w:val="16"/>
           <w:szCs w:val="16"/>
         </w:rPr>
-        <w:t xml:space="preserve">(del #46 al #49, el mateix error, amb els fallits de 8 a 11)</w:t>
-      </w:r>
-    </w:p>
-    <w:p>
-      <w:pPr>
-        <w:keepNext/>
+        <w:t xml:space="preserve">(del #46 al #50, el mateix error)</w:t>
+      </w:r>
+    </w:p>
+    <w:p>
+      <w:pPr>
+        <w:keepNext w:val="false"/>
         <w:keepLines/>
         <w:shd w:fill="F2F2F2" w:color="auto" w:val="clear"/>
-        <w:spacing w:after="0" w:before="0" w:line="240"/>
+        <w:spacing w:after="160" w:before="0" w:line="250"/>
         <w:ind w:left="120" w:right="120"/>
       </w:pPr>
       <w:r>
@@ -2266,155 +2358,83 @@
           <w:sz w:val="16"/>
           <w:szCs w:val="16"/>
         </w:rPr>
-        <w:t xml:space="preserve">[REST] POST #50 -&gt; ERROR -1, connection refused (2003 ms) | ok 38, fallits 12</w:t>
+        <w:t xml:space="preserve">[REST] POST #51 -&gt; 201 (204 ms) | ok 39, fallits 12 | {… "temps_activitat":639}</w:t>
+      </w:r>
+    </w:p>
+    <w:p>
+      <w:pPr>
+        <w:spacing w:after="140" w:line="276"/>
+      </w:pPr>
+      <w:r>
+        <w:t xml:space="preserve">El node segueix en OPERATIU, ho torna a provar cada 10 s i es recupera sol. Les 6 mostres d'aquell minut es perden: al fitxer hi ha un forat de 70 s.</w:t>
       </w:r>
     </w:p>
     <w:p>
       <w:pPr>
         <w:keepNext/>
-        <w:keepLines/>
-        <w:shd w:fill="F2F2F2" w:color="auto" w:val="clear"/>
-        <w:spacing w:after="0" w:before="0" w:line="240"/>
-        <w:ind w:left="120" w:right="120"/>
-      </w:pPr>
-      <w:r>
-        <w:rPr>
-          <w:rFonts w:ascii="Consolas" w:cs="Consolas" w:eastAsia="Consolas" w:hAnsi="Consolas"/>
-          <w:i w:val="false"/>
-          <w:iCs w:val="false"/>
-          <w:sz w:val="16"/>
-          <w:szCs w:val="16"/>
-        </w:rPr>
-        <w:t xml:space="preserve">[REST] POST #51 -&gt; 201 (204 ms) | ok 39, fallits 12 | {… "temps_activitat":639}</w:t>
-      </w:r>
-    </w:p>
-    <w:p>
-      <w:pPr>
-        <w:keepNext/>
-        <w:keepLines/>
-        <w:shd w:fill="F2F2F2" w:color="auto" w:val="clear"/>
-        <w:spacing w:after="0" w:before="0" w:line="240"/>
-        <w:ind w:left="120" w:right="120"/>
-      </w:pPr>
-      <w:r>
-        <w:rPr>
-          <w:rFonts w:ascii="Consolas" w:cs="Consolas" w:eastAsia="Consolas" w:hAnsi="Consolas"/>
-          <w:i w:val="false"/>
-          <w:iCs w:val="false"/>
-          <w:sz w:val="16"/>
-          <w:szCs w:val="16"/>
-        </w:rPr>
-        <w:t xml:space="preserve">{… "temps_activitat":569,"rebut":"2026-10-07T15:19:07.424Z"}</w:t>
-      </w:r>
-    </w:p>
-    <w:p>
-      <w:pPr>
-        <w:keepNext w:val="false"/>
-        <w:keepLines/>
-        <w:shd w:fill="F2F2F2" w:color="auto" w:val="clear"/>
-        <w:spacing w:after="120" w:before="0" w:line="240"/>
-        <w:ind w:left="120" w:right="120"/>
-      </w:pPr>
-      <w:r>
-        <w:rPr>
-          <w:rFonts w:ascii="Consolas" w:cs="Consolas" w:eastAsia="Consolas" w:hAnsi="Consolas"/>
-          <w:i w:val="false"/>
-          <w:iCs w:val="false"/>
-          <w:sz w:val="16"/>
-          <w:szCs w:val="16"/>
-        </w:rPr>
-        <w:t xml:space="preserve">{… "temps_activitat":639,"rebut":"2026-10-07T15:20:17.568Z"}</w:t>
-      </w:r>
-    </w:p>
-    <w:p>
-      <w:pPr>
-        <w:spacing w:after="90" w:line="259"/>
-      </w:pPr>
-      <w:r>
-        <w:t xml:space="preserve">El node es manté en OPERATIU, perquè la seva Wi-Fi funciona, i ho torna a provar cada 10 s. Cada intent dura 2 s, que és el límit de connexió que s'ha posat perquè no es quedi penjat; «connection refused» és el nom genèric que fa servir la biblioteca. Quan el Raspberry torna, el primer POST ja funciona. Al fitxer hi ha un forat de 70 s entre les mostres de 569 s i 639 s: les 6 mostres d'aquell minut s'han perdut, perquè el node no les guarda.</w:t>
-      </w:r>
-    </w:p>
-    <w:p>
-      <w:pPr>
-        <w:keepNext/>
-        <w:spacing w:after="80" w:before="200"/>
+        <w:spacing w:after="140" w:before="320"/>
       </w:pPr>
       <w:r>
         <w:rPr>
           <w:b/>
           <w:bCs/>
-          <w:sz w:val="25"/>
-          <w:szCs w:val="25"/>
+          <w:color w:val="1F3864"/>
+          <w:sz w:val="26"/>
+          <w:szCs w:val="26"/>
         </w:rPr>
         <w:t xml:space="preserve">7. Conclusions</w:t>
       </w:r>
     </w:p>
     <w:p>
       <w:pPr>
-        <w:spacing w:after="90" w:line="259"/>
-      </w:pPr>
-      <w:r>
-        <w:t xml:space="preserve">El cicle complet funciona: configuració per BLE, persistència a la NVS, recuperació després d'un reinici, restabliment de fàbrica i telemetria REST. En arribar a OPERATIU el node deixa d'anunciar-se, perquè la Wi-Fi i el BLE comparteixen la mateixa ràdio de 2,4 GHz. Les dificultats han estat la IP del Raspberry, que canvia cada dia; el mal contacte del DHT22; les notificacions a l'iPhone, que no s'activaven; i la compilació a l'Arduino IDE, que tardava uns 20 minuts.</w:t>
-      </w:r>
-    </w:p>
-    <w:p>
-      <w:pPr>
-        <w:spacing w:after="90" w:line="259"/>
-      </w:pPr>
-      <w:r>
-        <w:t xml:space="preserve">Com a millores, el node podria guardar a la RAM les mostres que no ha pogut enviar i reenviar-les quan el servidor torni, i fer el POST en una tasca a part perquè el programa no es bloquegi 2 s. També hem vist que el driver de la Wi-Fi guarda pel seu compte una còpia del SSID i de la clau a la NVS, i que el restabliment actual no l'esborra. Amb </w:t>
-      </w:r>
-      <w:r>
-        <w:rPr>
-          <w:rFonts w:ascii="Consolas" w:cs="Consolas" w:eastAsia="Consolas" w:hAnsi="Consolas"/>
-          <w:sz w:val="18"/>
-          <w:szCs w:val="18"/>
-        </w:rPr>
-        <w:t xml:space="preserve">WiFi.persistent(false)</w:t>
-      </w:r>
-      <w:r>
-        <w:t xml:space="preserve"> la clau quedaria només a l'espai de noms </w:t>
-      </w:r>
-      <w:r>
-        <w:rPr>
-          <w:rFonts w:ascii="Consolas" w:cs="Consolas" w:eastAsia="Consolas" w:hAnsi="Consolas"/>
-          <w:sz w:val="18"/>
-          <w:szCs w:val="18"/>
-        </w:rPr>
-        <w:t xml:space="preserve">wifi</w:t>
-      </w:r>
-      <w:r>
-        <w:t xml:space="preserve">.</w:t>
-      </w:r>
-    </w:p>
-    <w:p>
-      <w:pPr>
-        <w:spacing w:after="90" w:line="259"/>
-      </w:pPr>
-      <w:r>
-        <w:t xml:space="preserve">Al repositori, a </w:t>
-      </w:r>
-      <w:r>
-        <w:rPr>
-          <w:rFonts w:ascii="Consolas" w:cs="Consolas" w:eastAsia="Consolas" w:hAnsi="Consolas"/>
-          <w:sz w:val="18"/>
-          <w:szCs w:val="18"/>
-        </w:rPr>
-        <w:t xml:space="preserve">docs/p2/</w:t>
-      </w:r>
-      <w:r>
-        <w:t xml:space="preserve">, hi ha també les captures i les dades en brut de totes les proves (</w:t>
-      </w:r>
-      <w:r>
-        <w:rPr>
-          <w:rFonts w:ascii="Consolas" w:cs="Consolas" w:eastAsia="Consolas" w:hAnsi="Consolas"/>
-          <w:sz w:val="18"/>
-          <w:szCs w:val="18"/>
-        </w:rPr>
-        <w:t xml:space="preserve">mesures_laboratori.md</w:t>
-      </w:r>
-      <w:r>
-        <w:t xml:space="preserve">).</w:t>
+        <w:pStyle w:val="ListParagraph"/>
+        <w:numPr>
+          <w:ilvl w:val="0"/>
+          <w:numId w:val="2"/>
+        </w:numPr>
+        <w:spacing w:after="80" w:line="276"/>
+      </w:pPr>
+      <w:r>
+        <w:t xml:space="preserve">Funciona tot el cicle: configuració per BLE, NVS, reinici, restabliment de fàbrica i telemetria REST.</w:t>
+      </w:r>
+    </w:p>
+    <w:p>
+      <w:pPr>
+        <w:pStyle w:val="ListParagraph"/>
+        <w:numPr>
+          <w:ilvl w:val="0"/>
+          <w:numId w:val="2"/>
+        </w:numPr>
+        <w:spacing w:after="80" w:line="276"/>
+      </w:pPr>
+      <w:r>
+        <w:t xml:space="preserve">En OPERATIU el node deixa d'anunciar-se, perquè la Wi-Fi i el BLE comparteixen la ràdio de 2,4 GHz.</w:t>
+      </w:r>
+    </w:p>
+    <w:p>
+      <w:pPr>
+        <w:pStyle w:val="ListParagraph"/>
+        <w:numPr>
+          <w:ilvl w:val="0"/>
+          <w:numId w:val="2"/>
+        </w:numPr>
+        <w:spacing w:after="80" w:line="276"/>
+      </w:pPr>
+      <w:r>
+        <w:t xml:space="preserve">Problemes: la IP del Raspberry canvia cada dia, un mal contacte del DHT22 i les notificacions a l'iPhone.</w:t>
+      </w:r>
+    </w:p>
+    <w:p>
+      <w:pPr>
+        <w:pStyle w:val="ListParagraph"/>
+        <w:numPr>
+          <w:ilvl w:val="0"/>
+          <w:numId w:val="2"/>
+        </w:numPr>
+        <w:spacing w:after="80" w:line="276"/>
+      </w:pPr>
+      <w:r>
+        <w:t xml:space="preserve">Millores: guardar les mostres no enviades i reenviar-les després, fer el POST en una tasca a part i esborrar també la còpia de la clau que guarda el driver de la Wi-Fi.</w:t>
       </w:r>
     </w:p>
     <w:sectPr>
@@ -2645,8 +2665,8 @@
     <w:rPrDefault>
       <w:rPr>
         <w:rFonts w:ascii="Calibri" w:cs="Calibri" w:eastAsia="Calibri" w:hAnsi="Calibri"/>
-        <w:sz w:val="20"/>
-        <w:szCs w:val="20"/>
+        <w:sz w:val="21"/>
+        <w:szCs w:val="21"/>
       </w:rPr>
     </w:rPrDefault>
     <w:pPrDefault/>

</xml_diff>

<commit_message>
P2: informe amb 9 figures (3 pagines)
Afegides la foto del muntatge, la captura del 2902 desactivat i la IP del
Raspberry. Les captures noves tambe son a docs/p2/captures.

Co-Authored-By: Claude Opus 5.5 <noreply@anthropic.com>
Claude-Session: https://claude.ai/code/session_01UnUvVZKn9osMEiiGWQM6PM
</commit_message>
<xml_diff>
--- a/docs/p2/Informe_Practica_2_Pau_Vila.docx
+++ b/docs/p2/Informe_Practica_2_Pau_Vila.docx
@@ -86,7 +86,7 @@
     <w:p>
       <w:pPr>
         <w:keepNext/>
-        <w:spacing w:after="140" w:before="320"/>
+        <w:spacing w:after="120" w:before="280"/>
       </w:pPr>
       <w:r>
         <w:rPr>
@@ -99,25 +99,150 @@
         <w:t xml:space="preserve">1. Muntatge i màquina d'estats</w:t>
       </w:r>
     </w:p>
-    <w:p>
-      <w:pPr>
-        <w:spacing w:after="140" w:line="276"/>
-      </w:pPr>
-      <w:r>
-        <w:t xml:space="preserve">El node és el de la P1: un M5Stack AtomS3 amb el LED a G7, el polsador a G6 i el DHT22 a G8. El gateway és el Raspberry Pi amb Node-RED 4. Tot és al programa </w:t>
-      </w:r>
-      <w:r>
-        <w:rPr>
-          <w:rFonts w:ascii="Consolas" w:cs="Consolas" w:eastAsia="Consolas" w:hAnsi="Consolas"/>
-          <w:sz w:val="18"/>
-          <w:szCs w:val="18"/>
-        </w:rPr>
-        <w:t xml:space="preserve">p2_node.ino</w:t>
-      </w:r>
-      <w:r>
-        <w:t xml:space="preserve">, i les proves es van fer al laboratori el 07/10/2026.</w:t>
-      </w:r>
-    </w:p>
+    <w:tbl>
+      <w:tblPr>
+        <w:tblW w:type="dxa" w:w="9638"/>
+        <w:tblBorders>
+          <w:top w:val="none" w:color="FFFFFF" w:sz="0"/>
+          <w:left w:val="none" w:color="FFFFFF" w:sz="0"/>
+          <w:bottom w:val="none" w:color="FFFFFF" w:sz="0"/>
+          <w:right w:val="none" w:color="FFFFFF" w:sz="0"/>
+          <w:insideH w:val="none" w:color="FFFFFF" w:sz="0"/>
+          <w:insideV w:val="none" w:color="FFFFFF" w:sz="0"/>
+        </w:tblBorders>
+      </w:tblPr>
+      <w:tblGrid>
+        <w:gridCol w:w="5000"/>
+        <w:gridCol w:w="4638"/>
+      </w:tblGrid>
+      <w:tr>
+        <w:trPr>
+          <w:cantSplit/>
+        </w:trPr>
+        <w:tc>
+          <w:tcPr>
+            <w:tcW w:type="dxa" w:w="5000"/>
+            <w:tcBorders>
+              <w:top w:val="none" w:color="FFFFFF" w:sz="0"/>
+              <w:left w:val="none" w:color="FFFFFF" w:sz="0"/>
+              <w:bottom w:val="none" w:color="FFFFFF" w:sz="0"/>
+              <w:right w:val="none" w:color="FFFFFF" w:sz="0"/>
+            </w:tcBorders>
+            <w:tcMar>
+              <w:top w:type="dxa" w:w="120"/>
+              <w:left w:type="dxa" w:w="0"/>
+              <w:right w:type="dxa" w:w="240"/>
+            </w:tcMar>
+          </w:tcPr>
+          <w:p>
+            <w:pPr>
+              <w:spacing w:after="120" w:line="276"/>
+            </w:pPr>
+            <w:r>
+              <w:t xml:space="preserve">El node és el de la P1: un M5Stack AtomS3 amb el LED a G7, el polsador a G6 i el DHT22 a G8 (figura 1). El gateway és el Raspberry Pi amb Node-RED 4.</w:t>
+            </w:r>
+          </w:p>
+          <w:p>
+            <w:pPr>
+              <w:spacing w:after="120" w:line="276"/>
+            </w:pPr>
+            <w:r>
+              <w:t xml:space="preserve">Tot és al programa </w:t>
+            </w:r>
+            <w:r>
+              <w:rPr>
+                <w:rFonts w:ascii="Consolas" w:cs="Consolas" w:eastAsia="Consolas" w:hAnsi="Consolas"/>
+                <w:sz w:val="18"/>
+                <w:szCs w:val="18"/>
+              </w:rPr>
+              <w:t xml:space="preserve">p2_node.ino</w:t>
+            </w:r>
+            <w:r>
+              <w:t xml:space="preserve">, i les proves es van fer al laboratori el 07/10/2026.</w:t>
+            </w:r>
+          </w:p>
+        </w:tc>
+        <w:tc>
+          <w:tcPr>
+            <w:tcW w:type="dxa" w:w="4638"/>
+            <w:tcBorders>
+              <w:top w:val="none" w:color="FFFFFF" w:sz="0"/>
+              <w:left w:val="none" w:color="FFFFFF" w:sz="0"/>
+              <w:bottom w:val="none" w:color="FFFFFF" w:sz="0"/>
+              <w:right w:val="none" w:color="FFFFFF" w:sz="0"/>
+            </w:tcBorders>
+            <w:tcMar>
+              <w:top w:type="dxa" w:w="0"/>
+              <w:left w:type="dxa" w:w="120"/>
+              <w:right w:type="dxa" w:w="0"/>
+            </w:tcMar>
+          </w:tcPr>
+          <w:p>
+            <w:pPr>
+              <w:keepNext/>
+              <w:spacing w:after="0" w:before="100"/>
+              <w:jc w:val="center"/>
+            </w:pPr>
+            <w:r>
+              <w:drawing>
+                <wp:inline distT="0" distB="0" distL="0" distR="0">
+                  <wp:extent cx="2381250" cy="1009650"/>
+                  <wp:effectExtent t="0" r="0" b="0" l="0"/>
+                  <wp:docPr id="1" name="Muntatge del node" descr="Muntatge del node" title="Muntatge del node"/>
+                  <wp:cNvGraphicFramePr>
+                    <a:graphicFrameLocks xmlns:a="http://schemas.openxmlformats.org/drawingml/2006/main" noChangeAspect="1"/>
+                  </wp:cNvGraphicFramePr>
+                  <a:graphic xmlns:a="http://schemas.openxmlformats.org/drawingml/2006/main">
+                    <a:graphicData uri="http://schemas.openxmlformats.org/drawingml/2006/picture">
+                      <pic:pic xmlns:pic="http://schemas.openxmlformats.org/drawingml/2006/picture">
+                        <pic:nvPicPr>
+                          <pic:cNvPr id="0" name="" descr=""/>
+                          <pic:cNvPicPr>
+                            <a:picLocks noChangeAspect="1" noChangeArrowheads="1"/>
+                          </pic:cNvPicPr>
+                        </pic:nvPicPr>
+                        <pic:blipFill>
+                          <a:blip r:embed="rId8" cstate="none"/>
+                          <a:srcRect/>
+                          <a:stretch>
+                            <a:fillRect/>
+                          </a:stretch>
+                        </pic:blipFill>
+                        <pic:spPr bwMode="auto">
+                          <a:xfrm>
+                            <a:off x="0" y="0"/>
+                            <a:ext cx="2381250" cy="1009650"/>
+                          </a:xfrm>
+                          <a:prstGeom prst="rect">
+                            <a:avLst/>
+                          </a:prstGeom>
+                        </pic:spPr>
+                      </pic:pic>
+                    </a:graphicData>
+                  </a:graphic>
+                </wp:inline>
+              </w:drawing>
+            </w:r>
+          </w:p>
+          <w:p>
+            <w:pPr>
+              <w:spacing w:after="180" w:before="60"/>
+              <w:jc w:val="center"/>
+            </w:pPr>
+            <w:r>
+              <w:rPr>
+                <w:i/>
+                <w:iCs/>
+                <w:color w:val="404040"/>
+                <w:sz w:val="18"/>
+                <w:szCs w:val="18"/>
+              </w:rPr>
+              <w:t xml:space="preserve">Figura 1. Muntatge: LED, polsador i DHT22 a la protoboard.</w:t>
+            </w:r>
+          </w:p>
+        </w:tc>
+      </w:tr>
+    </w:tbl>
     <w:p>
       <w:pPr>
         <w:keepNext/>
@@ -127,7 +252,7 @@
       <w:r>
         <w:drawing>
           <wp:inline distT="0" distB="0" distL="0" distR="0">
-            <wp:extent cx="6096000" cy="914400"/>
+            <wp:extent cx="5619750" cy="838200"/>
             <wp:effectExtent t="0" r="0" b="0" l="0"/>
             <wp:docPr id="1" name="Màquina d'estats" descr="Màquina d'estats" title="Màquina d'estats"/>
             <wp:cNvGraphicFramePr>
@@ -143,7 +268,7 @@
                     </pic:cNvPicPr>
                   </pic:nvPicPr>
                   <pic:blipFill>
-                    <a:blip r:embed="rId8" cstate="none"/>
+                    <a:blip r:embed="rId9" cstate="none"/>
                     <a:srcRect/>
                     <a:stretch>
                       <a:fillRect/>
@@ -152,7 +277,7 @@
                   <pic:spPr bwMode="auto">
                     <a:xfrm>
                       <a:off x="0" y="0"/>
-                      <a:ext cx="6096000" cy="914400"/>
+                      <a:ext cx="5619750" cy="838200"/>
                     </a:xfrm>
                     <a:prstGeom prst="rect">
                       <a:avLst/>
@@ -167,7 +292,7 @@
     </w:p>
     <w:p>
       <w:pPr>
-        <w:spacing w:after="220" w:before="60"/>
+        <w:spacing w:after="180" w:before="60"/>
         <w:jc w:val="center"/>
       </w:pPr>
       <w:r>
@@ -178,7 +303,7 @@
           <w:sz w:val="18"/>
           <w:szCs w:val="18"/>
         </w:rPr>
-        <w:t xml:space="preserve">Figura 1. Màquina d'estats implementada. Els colors són els de la pantalla del node.</w:t>
+        <w:t xml:space="preserve">Figura 2. Màquina d'estats implementada. Els colors són els de la pantalla del node.</w:t>
       </w:r>
     </w:p>
     <w:p>
@@ -232,7 +357,7 @@
     <w:p>
       <w:pPr>
         <w:keepNext/>
-        <w:spacing w:after="140" w:before="320"/>
+        <w:spacing w:after="120" w:before="280"/>
       </w:pPr>
       <w:r>
         <w:rPr>
@@ -248,7 +373,7 @@
     <w:p>
       <w:pPr>
         <w:keepNext/>
-        <w:spacing w:after="140" w:line="276"/>
+        <w:spacing w:after="120" w:line="276"/>
       </w:pPr>
       <w:r>
         <w:t xml:space="preserve">Servei propi amb tres característiques. Tots els UUID són de 128 bits, generats a l'atzar:</w:t>
@@ -785,7 +910,7 @@
           </w:tcPr>
           <w:p>
             <w:pPr>
-              <w:spacing w:after="140" w:line="276"/>
+              <w:spacing w:after="120" w:line="276"/>
             </w:pPr>
             <w:r>
               <w:t xml:space="preserve">El node s'anuncia com a </w:t>
@@ -798,15 +923,15 @@
               <w:t xml:space="preserve">Node-Pau</w:t>
             </w:r>
             <w:r>
-              <w:t xml:space="preserve"> amb el UUID del servei, i les característiques que notifiquen porten el descriptor 2902 (figura 2).</w:t>
-            </w:r>
-          </w:p>
-          <w:p>
-            <w:pPr>
-              <w:spacing w:after="140" w:line="276"/>
-            </w:pPr>
-            <w:r>
-              <w:t xml:space="preserve">Amb l'nRF Connect per a iOS el 2902 sempre quedava a «Disabled» i el mòbil no rebia les notificacions. Per això els canvis d'estat es van comprovar llegint la característica estat i pel port sèrie.</w:t>
+              <w:t xml:space="preserve"> amb el UUID del servei, i les característiques que notifiquen porten el descriptor 2902 (figura 3).</w:t>
+            </w:r>
+          </w:p>
+          <w:p>
+            <w:pPr>
+              <w:spacing w:after="120" w:line="276"/>
+            </w:pPr>
+            <w:r>
+              <w:t xml:space="preserve">Amb l'nRF Connect per a iOS el 2902 sempre quedava a «Disabled» (figura 7) i el mòbil no rebia les notificacions. Per això els canvis d'estat es van comprovar llegint la característica estat i pel port sèrie.</w:t>
             </w:r>
           </w:p>
         </w:tc>
@@ -834,7 +959,7 @@
             <w:r>
               <w:drawing>
                 <wp:inline distT="0" distB="0" distL="0" distR="0">
-                  <wp:extent cx="2667000" cy="1971675"/>
+                  <wp:extent cx="2143125" cy="1590675"/>
                   <wp:effectExtent t="0" r="0" b="0" l="0"/>
                   <wp:docPr id="1" name="Captures de l'nRF Connect" descr="Captures de l'nRF Connect" title="Captures de l'nRF Connect"/>
                   <wp:cNvGraphicFramePr>
@@ -850,7 +975,7 @@
                           </pic:cNvPicPr>
                         </pic:nvPicPr>
                         <pic:blipFill>
-                          <a:blip r:embed="rId9" cstate="none"/>
+                          <a:blip r:embed="rId10" cstate="none"/>
                           <a:srcRect/>
                           <a:stretch>
                             <a:fillRect/>
@@ -859,7 +984,7 @@
                         <pic:spPr bwMode="auto">
                           <a:xfrm>
                             <a:off x="0" y="0"/>
-                            <a:ext cx="2667000" cy="1971675"/>
+                            <a:ext cx="2143125" cy="1590675"/>
                           </a:xfrm>
                           <a:prstGeom prst="rect">
                             <a:avLst/>
@@ -874,7 +999,7 @@
           </w:p>
           <w:p>
             <w:pPr>
-              <w:spacing w:after="220" w:before="60"/>
+              <w:spacing w:after="180" w:before="60"/>
               <w:jc w:val="center"/>
             </w:pPr>
             <w:r>
@@ -885,7 +1010,7 @@
                 <w:sz w:val="18"/>
                 <w:szCs w:val="18"/>
               </w:rPr>
-              <w:t xml:space="preserve">Figura 2. nRF Connect: servei anunciat i característiques.</w:t>
+              <w:t xml:space="preserve">Figura 3. nRF Connect: servei anunciat i característiques.</w:t>
             </w:r>
           </w:p>
         </w:tc>
@@ -894,7 +1019,7 @@
     <w:p>
       <w:pPr>
         <w:keepNext/>
-        <w:spacing w:after="140" w:before="320"/>
+        <w:spacing w:after="120" w:before="280"/>
       </w:pPr>
       <w:r>
         <w:rPr>
@@ -909,7 +1034,7 @@
     </w:p>
     <w:p>
       <w:pPr>
-        <w:spacing w:after="140" w:line="276"/>
+        <w:spacing w:after="120" w:line="276"/>
       </w:pPr>
       <w:r>
         <w:t xml:space="preserve">El mòbil escriu </w:t>
@@ -923,7 +1048,7 @@
         <w:t xml:space="preserve">{"ssid":"…","pass":"…"}</w:t>
       </w:r>
       <w:r>
-        <w:t xml:space="preserve"> a credencials. El node valida el JSON, notifica CONNECTANT i fa fins a 3 intents de 10 s. Quan té IP, desa les credencials a la NVS, notifica OPERATIU amb la IP i ho mostra a la pantalla (figura 3). Al port sèrie només surten el SSID i la longitud de la clau (figura 4).</w:t>
+        <w:t xml:space="preserve"> a credencials. El node valida el JSON, notifica CONNECTANT i fa fins a 3 intents de 10 s. Quan té IP, desa les credencials a la NVS, notifica OPERATIU amb la IP i ho mostra a la pantalla (figura 4). Al port sèrie només surten el SSID i la longitud de la clau (figura 5).</w:t>
       </w:r>
     </w:p>
     <w:p>
@@ -935,72 +1060,9 @@
       <w:r>
         <w:drawing>
           <wp:inline distT="0" distB="0" distL="0" distR="0">
-            <wp:extent cx="3238500" cy="1590675"/>
+            <wp:extent cx="2762250" cy="1362075"/>
             <wp:effectExtent t="0" r="0" b="0" l="0"/>
             <wp:docPr id="1" name="Pantalla del node" descr="Pantalla del node" title="Pantalla del node"/>
-            <wp:cNvGraphicFramePr>
-              <a:graphicFrameLocks xmlns:a="http://schemas.openxmlformats.org/drawingml/2006/main" noChangeAspect="1"/>
-            </wp:cNvGraphicFramePr>
-            <a:graphic xmlns:a="http://schemas.openxmlformats.org/drawingml/2006/main">
-              <a:graphicData uri="http://schemas.openxmlformats.org/drawingml/2006/picture">
-                <pic:pic xmlns:pic="http://schemas.openxmlformats.org/drawingml/2006/picture">
-                  <pic:nvPicPr>
-                    <pic:cNvPr id="0" name="" descr=""/>
-                    <pic:cNvPicPr>
-                      <a:picLocks noChangeAspect="1" noChangeArrowheads="1"/>
-                    </pic:cNvPicPr>
-                  </pic:nvPicPr>
-                  <pic:blipFill>
-                    <a:blip r:embed="rId10" cstate="none"/>
-                    <a:srcRect/>
-                    <a:stretch>
-                      <a:fillRect/>
-                    </a:stretch>
-                  </pic:blipFill>
-                  <pic:spPr bwMode="auto">
-                    <a:xfrm>
-                      <a:off x="0" y="0"/>
-                      <a:ext cx="3238500" cy="1590675"/>
-                    </a:xfrm>
-                    <a:prstGeom prst="rect">
-                      <a:avLst/>
-                    </a:prstGeom>
-                  </pic:spPr>
-                </pic:pic>
-              </a:graphicData>
-            </a:graphic>
-          </wp:inline>
-        </w:drawing>
-      </w:r>
-    </w:p>
-    <w:p>
-      <w:pPr>
-        <w:spacing w:after="220" w:before="60"/>
-        <w:jc w:val="center"/>
-      </w:pPr>
-      <w:r>
-        <w:rPr>
-          <w:i/>
-          <w:iCs/>
-          <w:color w:val="404040"/>
-          <w:sz w:val="18"/>
-          <w:szCs w:val="18"/>
-        </w:rPr>
-        <w:t xml:space="preserve">Figura 3. Pantalla del node esperant credencials i en OPERATIU (IP, temps de configuració, temperatura i últim POST).</w:t>
-      </w:r>
-    </w:p>
-    <w:p>
-      <w:pPr>
-        <w:keepNext/>
-        <w:spacing w:after="0" w:before="100"/>
-        <w:jc w:val="center"/>
-      </w:pPr>
-      <w:r>
-        <w:drawing>
-          <wp:inline distT="0" distB="0" distL="0" distR="0">
-            <wp:extent cx="5715000" cy="1933575"/>
-            <wp:effectExtent t="0" r="0" b="0" l="0"/>
-            <wp:docPr id="1" name="Port sèrie" descr="Port sèrie" title="Port sèrie"/>
             <wp:cNvGraphicFramePr>
               <a:graphicFrameLocks xmlns:a="http://schemas.openxmlformats.org/drawingml/2006/main" noChangeAspect="1"/>
             </wp:cNvGraphicFramePr>
@@ -1023,7 +1085,7 @@
                   <pic:spPr bwMode="auto">
                     <a:xfrm>
                       <a:off x="0" y="0"/>
-                      <a:ext cx="5715000" cy="1933575"/>
+                      <a:ext cx="2762250" cy="1362075"/>
                     </a:xfrm>
                     <a:prstGeom prst="rect">
                       <a:avLst/>
@@ -1038,7 +1100,7 @@
     </w:p>
     <w:p>
       <w:pPr>
-        <w:spacing w:after="220" w:before="60"/>
+        <w:spacing w:after="180" w:before="60"/>
         <w:jc w:val="center"/>
       </w:pPr>
       <w:r>
@@ -1049,7 +1111,70 @@
           <w:sz w:val="18"/>
           <w:szCs w:val="18"/>
         </w:rPr>
-        <w:t xml:space="preserve">Figura 4. Port sèrie: configuració correcta (esquerra) i amb una clau incorrecta (dreta).</w:t>
+        <w:t xml:space="preserve">Figura 4. Pantalla del node esperant credencials i en OPERATIU (IP, temps de configuració, temperatura i últim POST).</w:t>
+      </w:r>
+    </w:p>
+    <w:p>
+      <w:pPr>
+        <w:keepNext/>
+        <w:spacing w:after="0" w:before="100"/>
+        <w:jc w:val="center"/>
+      </w:pPr>
+      <w:r>
+        <w:drawing>
+          <wp:inline distT="0" distB="0" distL="0" distR="0">
+            <wp:extent cx="5143500" cy="1733550"/>
+            <wp:effectExtent t="0" r="0" b="0" l="0"/>
+            <wp:docPr id="1" name="Port sèrie" descr="Port sèrie" title="Port sèrie"/>
+            <wp:cNvGraphicFramePr>
+              <a:graphicFrameLocks xmlns:a="http://schemas.openxmlformats.org/drawingml/2006/main" noChangeAspect="1"/>
+            </wp:cNvGraphicFramePr>
+            <a:graphic xmlns:a="http://schemas.openxmlformats.org/drawingml/2006/main">
+              <a:graphicData uri="http://schemas.openxmlformats.org/drawingml/2006/picture">
+                <pic:pic xmlns:pic="http://schemas.openxmlformats.org/drawingml/2006/picture">
+                  <pic:nvPicPr>
+                    <pic:cNvPr id="0" name="" descr=""/>
+                    <pic:cNvPicPr>
+                      <a:picLocks noChangeAspect="1" noChangeArrowheads="1"/>
+                    </pic:cNvPicPr>
+                  </pic:nvPicPr>
+                  <pic:blipFill>
+                    <a:blip r:embed="rId12" cstate="none"/>
+                    <a:srcRect/>
+                    <a:stretch>
+                      <a:fillRect/>
+                    </a:stretch>
+                  </pic:blipFill>
+                  <pic:spPr bwMode="auto">
+                    <a:xfrm>
+                      <a:off x="0" y="0"/>
+                      <a:ext cx="5143500" cy="1733550"/>
+                    </a:xfrm>
+                    <a:prstGeom prst="rect">
+                      <a:avLst/>
+                    </a:prstGeom>
+                  </pic:spPr>
+                </pic:pic>
+              </a:graphicData>
+            </a:graphic>
+          </wp:inline>
+        </w:drawing>
+      </w:r>
+    </w:p>
+    <w:p>
+      <w:pPr>
+        <w:spacing w:after="180" w:before="60"/>
+        <w:jc w:val="center"/>
+      </w:pPr>
+      <w:r>
+        <w:rPr>
+          <w:i/>
+          <w:iCs/>
+          <w:color w:val="404040"/>
+          <w:sz w:val="18"/>
+          <w:szCs w:val="18"/>
+        </w:rPr>
+        <w:t xml:space="preserve">Figura 5. Port sèrie: configuració correcta (esquerra) i amb una clau incorrecta (dreta).</w:t>
       </w:r>
     </w:p>
     <w:p>
@@ -1610,7 +1735,7 @@
     <w:p>
       <w:pPr>
         <w:keepNext/>
-        <w:spacing w:after="140" w:before="320"/>
+        <w:spacing w:after="120" w:before="280"/>
       </w:pPr>
       <w:r>
         <w:rPr>
@@ -1626,7 +1751,7 @@
     <w:p>
       <w:pPr>
         <w:keepNext/>
-        <w:spacing w:after="140" w:line="276"/>
+        <w:spacing w:after="120" w:line="276"/>
       </w:pPr>
       <w:r>
         <w:t xml:space="preserve">Si es manté premut el polsador, a partir del tercer segon la pantalla es posa vermella amb un compte enrere i el LED fa pampallugues a 10 Hz. Als 5 s el node esborra l'espai de noms </w:t>
@@ -1640,7 +1765,7 @@
         <w:t xml:space="preserve">wifi</w:t>
       </w:r>
       <w:r>
-        <w:t xml:space="preserve"> de la NVS i es reinicia (figura 5).</w:t>
+        <w:t xml:space="preserve"> de la NVS i es reinicia (figura 6).</w:t>
       </w:r>
     </w:p>
     <w:p>
@@ -1652,120 +1777,9 @@
       <w:r>
         <w:drawing>
           <wp:inline distT="0" distB="0" distL="0" distR="0">
-            <wp:extent cx="5334000" cy="1390650"/>
+            <wp:extent cx="4857750" cy="1266825"/>
             <wp:effectExtent t="0" r="0" b="0" l="0"/>
             <wp:docPr id="1" name="Seqüència del restabliment" descr="Seqüència del restabliment" title="Seqüència del restabliment"/>
-            <wp:cNvGraphicFramePr>
-              <a:graphicFrameLocks xmlns:a="http://schemas.openxmlformats.org/drawingml/2006/main" noChangeAspect="1"/>
-            </wp:cNvGraphicFramePr>
-            <a:graphic xmlns:a="http://schemas.openxmlformats.org/drawingml/2006/main">
-              <a:graphicData uri="http://schemas.openxmlformats.org/drawingml/2006/picture">
-                <pic:pic xmlns:pic="http://schemas.openxmlformats.org/drawingml/2006/picture">
-                  <pic:nvPicPr>
-                    <pic:cNvPr id="0" name="" descr=""/>
-                    <pic:cNvPicPr>
-                      <a:picLocks noChangeAspect="1" noChangeArrowheads="1"/>
-                    </pic:cNvPicPr>
-                  </pic:nvPicPr>
-                  <pic:blipFill>
-                    <a:blip r:embed="rId12" cstate="none"/>
-                    <a:srcRect/>
-                    <a:stretch>
-                      <a:fillRect/>
-                    </a:stretch>
-                  </pic:blipFill>
-                  <pic:spPr bwMode="auto">
-                    <a:xfrm>
-                      <a:off x="0" y="0"/>
-                      <a:ext cx="5334000" cy="1390650"/>
-                    </a:xfrm>
-                    <a:prstGeom prst="rect">
-                      <a:avLst/>
-                    </a:prstGeom>
-                  </pic:spPr>
-                </pic:pic>
-              </a:graphicData>
-            </a:graphic>
-          </wp:inline>
-        </w:drawing>
-      </w:r>
-    </w:p>
-    <w:p>
-      <w:pPr>
-        <w:spacing w:after="220" w:before="60"/>
-        <w:jc w:val="center"/>
-      </w:pPr>
-      <w:r>
-        <w:rPr>
-          <w:i/>
-          <w:iCs/>
-          <w:color w:val="404040"/>
-          <w:sz w:val="18"/>
-          <w:szCs w:val="18"/>
-        </w:rPr>
-        <w:t xml:space="preserve">Figura 5. OPERATIU → avís a 3,1 s i a 4,2 s → ESBORRANT als 5 s → SENSE CREDENCIALS després del reinici.</w:t>
-      </w:r>
-    </w:p>
-    <w:p>
-      <w:pPr>
-        <w:spacing w:after="140" w:line="276"/>
-      </w:pPr>
-      <w:r>
-        <w:t xml:space="preserve">Si es deixa anar als 4,1 s no passa res («cancel.lat, no passa res») i el node continua en OPERATIU. Després del restabliment es torna a anunciar i accepta credencials noves.</w:t>
-      </w:r>
-    </w:p>
-    <w:p>
-      <w:pPr>
-        <w:keepNext/>
-        <w:spacing w:after="140" w:before="320"/>
-      </w:pPr>
-      <w:r>
-        <w:rPr>
-          <w:b/>
-          <w:bCs/>
-          <w:color w:val="1F3864"/>
-          <w:sz w:val="26"/>
-          <w:szCs w:val="26"/>
-        </w:rPr>
-        <w:t xml:space="preserve">5. Temperatura per BLE (exercici 4)</w:t>
-      </w:r>
-    </w:p>
-    <w:p>
-      <w:pPr>
-        <w:spacing w:after="140" w:line="276"/>
-      </w:pPr>
-      <w:r>
-        <w:t xml:space="preserve">El DHT22 es llegeix cada 2 s. La característica temperatura dona l'última lectura amb un decimal i la notifica només si hi ha un mòbil subscrit i el valor ha canviat com a mínim 0,1 °C. La mesura de notificacions per minut no s'ha pogut fer perquè el mòbil no activava el 2902.</w:t>
-      </w:r>
-    </w:p>
-    <w:p>
-      <w:pPr>
-        <w:keepNext/>
-        <w:spacing w:after="140" w:before="320"/>
-      </w:pPr>
-      <w:r>
-        <w:rPr>
-          <w:b/>
-          <w:bCs/>
-          <w:color w:val="1F3864"/>
-          <w:sz w:val="26"/>
-          <w:szCs w:val="26"/>
-        </w:rPr>
-        <w:t xml:space="preserve">6. Telemetria REST (exercici 5)</w:t>
-      </w:r>
-    </w:p>
-    <w:p>
-      <w:pPr>
-        <w:keepNext/>
-        <w:spacing w:after="0" w:before="100"/>
-        <w:jc w:val="center"/>
-      </w:pPr>
-      <w:r>
-        <w:drawing>
-          <wp:inline distT="0" distB="0" distL="0" distR="0">
-            <wp:extent cx="5715000" cy="561975"/>
-            <wp:effectExtent t="0" r="0" b="0" l="0"/>
-            <wp:docPr id="1" name="Flux de Node-RED" descr="Flux de Node-RED" title="Flux de Node-RED"/>
             <wp:cNvGraphicFramePr>
               <a:graphicFrameLocks xmlns:a="http://schemas.openxmlformats.org/drawingml/2006/main" noChangeAspect="1"/>
             </wp:cNvGraphicFramePr>
@@ -1788,7 +1802,7 @@
                   <pic:spPr bwMode="auto">
                     <a:xfrm>
                       <a:off x="0" y="0"/>
-                      <a:ext cx="5715000" cy="561975"/>
+                      <a:ext cx="4857750" cy="1266825"/>
                     </a:xfrm>
                     <a:prstGeom prst="rect">
                       <a:avLst/>
@@ -1803,7 +1817,7 @@
     </w:p>
     <w:p>
       <w:pPr>
-        <w:spacing w:after="220" w:before="60"/>
+        <w:spacing w:after="180" w:before="60"/>
         <w:jc w:val="center"/>
       </w:pPr>
       <w:r>
@@ -1814,7 +1828,243 @@
           <w:sz w:val="18"/>
           <w:szCs w:val="18"/>
         </w:rPr>
-        <w:t xml:space="preserve">Figura 6. Flux de Node-RED. El fitxer és a /home/pau/dades perquè l'usuari del Raspberry és pau.</w:t>
+        <w:t xml:space="preserve">Figura 6. OPERATIU → avís a 3,1 s i a 4,2 s → ESBORRANT als 5 s → SENSE CREDENCIALS després del reinici.</w:t>
+      </w:r>
+    </w:p>
+    <w:p>
+      <w:pPr>
+        <w:spacing w:after="120" w:line="276"/>
+      </w:pPr>
+      <w:r>
+        <w:t xml:space="preserve">Si es deixa anar als 4,1 s no passa res («cancel.lat, no passa res») i el node continua en OPERATIU. Després del restabliment es torna a anunciar i accepta credencials noves.</w:t>
+      </w:r>
+    </w:p>
+    <w:p>
+      <w:pPr>
+        <w:keepNext/>
+        <w:spacing w:after="120" w:before="280"/>
+      </w:pPr>
+      <w:r>
+        <w:rPr>
+          <w:b/>
+          <w:bCs/>
+          <w:color w:val="1F3864"/>
+          <w:sz w:val="26"/>
+          <w:szCs w:val="26"/>
+        </w:rPr>
+        <w:t xml:space="preserve">5. Temperatura per BLE (exercici 4)</w:t>
+      </w:r>
+    </w:p>
+    <w:tbl>
+      <w:tblPr>
+        <w:tblW w:type="dxa" w:w="9638"/>
+        <w:tblBorders>
+          <w:top w:val="none" w:color="FFFFFF" w:sz="0"/>
+          <w:left w:val="none" w:color="FFFFFF" w:sz="0"/>
+          <w:bottom w:val="none" w:color="FFFFFF" w:sz="0"/>
+          <w:right w:val="none" w:color="FFFFFF" w:sz="0"/>
+          <w:insideH w:val="none" w:color="FFFFFF" w:sz="0"/>
+          <w:insideV w:val="none" w:color="FFFFFF" w:sz="0"/>
+        </w:tblBorders>
+      </w:tblPr>
+      <w:tblGrid>
+        <w:gridCol w:w="6500"/>
+        <w:gridCol w:w="3138"/>
+      </w:tblGrid>
+      <w:tr>
+        <w:trPr>
+          <w:cantSplit/>
+        </w:trPr>
+        <w:tc>
+          <w:tcPr>
+            <w:tcW w:type="dxa" w:w="6500"/>
+            <w:tcBorders>
+              <w:top w:val="none" w:color="FFFFFF" w:sz="0"/>
+              <w:left w:val="none" w:color="FFFFFF" w:sz="0"/>
+              <w:bottom w:val="none" w:color="FFFFFF" w:sz="0"/>
+              <w:right w:val="none" w:color="FFFFFF" w:sz="0"/>
+            </w:tcBorders>
+            <w:tcMar>
+              <w:top w:type="dxa" w:w="120"/>
+              <w:left w:type="dxa" w:w="0"/>
+              <w:right w:type="dxa" w:w="240"/>
+            </w:tcMar>
+          </w:tcPr>
+          <w:p>
+            <w:pPr>
+              <w:spacing w:after="120" w:line="276"/>
+            </w:pPr>
+            <w:r>
+              <w:t xml:space="preserve">El DHT22 es llegeix cada 2 s. La característica temperatura dona l'última lectura amb un decimal i la notifica només si hi ha un mòbil subscrit i el valor ha canviat com a mínim 0,1 °C.</w:t>
+            </w:r>
+          </w:p>
+          <w:p>
+            <w:pPr>
+              <w:spacing w:after="120" w:line="276"/>
+            </w:pPr>
+            <w:r>
+              <w:t xml:space="preserve">La mesura de notificacions per minut no s'ha pogut fer perquè el mòbil no activava el descriptor 2902, que sempre llegia «Disabled» (figura 7).</w:t>
+            </w:r>
+          </w:p>
+        </w:tc>
+        <w:tc>
+          <w:tcPr>
+            <w:tcW w:type="dxa" w:w="3138"/>
+            <w:tcBorders>
+              <w:top w:val="none" w:color="FFFFFF" w:sz="0"/>
+              <w:left w:val="none" w:color="FFFFFF" w:sz="0"/>
+              <w:bottom w:val="none" w:color="FFFFFF" w:sz="0"/>
+              <w:right w:val="none" w:color="FFFFFF" w:sz="0"/>
+            </w:tcBorders>
+            <w:tcMar>
+              <w:top w:type="dxa" w:w="0"/>
+              <w:left w:type="dxa" w:w="120"/>
+              <w:right w:type="dxa" w:w="0"/>
+            </w:tcMar>
+          </w:tcPr>
+          <w:p>
+            <w:pPr>
+              <w:keepNext/>
+              <w:spacing w:after="0" w:before="100"/>
+              <w:jc w:val="center"/>
+            </w:pPr>
+            <w:r>
+              <w:drawing>
+                <wp:inline distT="0" distB="0" distL="0" distR="0">
+                  <wp:extent cx="1428750" cy="1181100"/>
+                  <wp:effectExtent t="0" r="0" b="0" l="0"/>
+                  <wp:docPr id="1" name="Descriptor 2902 desactivat" descr="Descriptor 2902 desactivat" title="Descriptor 2902 desactivat"/>
+                  <wp:cNvGraphicFramePr>
+                    <a:graphicFrameLocks xmlns:a="http://schemas.openxmlformats.org/drawingml/2006/main" noChangeAspect="1"/>
+                  </wp:cNvGraphicFramePr>
+                  <a:graphic xmlns:a="http://schemas.openxmlformats.org/drawingml/2006/main">
+                    <a:graphicData uri="http://schemas.openxmlformats.org/drawingml/2006/picture">
+                      <pic:pic xmlns:pic="http://schemas.openxmlformats.org/drawingml/2006/picture">
+                        <pic:nvPicPr>
+                          <pic:cNvPr id="0" name="" descr=""/>
+                          <pic:cNvPicPr>
+                            <a:picLocks noChangeAspect="1" noChangeArrowheads="1"/>
+                          </pic:cNvPicPr>
+                        </pic:nvPicPr>
+                        <pic:blipFill>
+                          <a:blip r:embed="rId14" cstate="none"/>
+                          <a:srcRect/>
+                          <a:stretch>
+                            <a:fillRect/>
+                          </a:stretch>
+                        </pic:blipFill>
+                        <pic:spPr bwMode="auto">
+                          <a:xfrm>
+                            <a:off x="0" y="0"/>
+                            <a:ext cx="1428750" cy="1181100"/>
+                          </a:xfrm>
+                          <a:prstGeom prst="rect">
+                            <a:avLst/>
+                          </a:prstGeom>
+                        </pic:spPr>
+                      </pic:pic>
+                    </a:graphicData>
+                  </a:graphic>
+                </wp:inline>
+              </w:drawing>
+            </w:r>
+          </w:p>
+          <w:p>
+            <w:pPr>
+              <w:spacing w:after="180" w:before="60"/>
+              <w:jc w:val="center"/>
+            </w:pPr>
+            <w:r>
+              <w:rPr>
+                <w:i/>
+                <w:iCs/>
+                <w:color w:val="404040"/>
+                <w:sz w:val="18"/>
+                <w:szCs w:val="18"/>
+              </w:rPr>
+              <w:t xml:space="preserve">Figura 7. El 2902 d'estat, desactivat.</w:t>
+            </w:r>
+          </w:p>
+        </w:tc>
+      </w:tr>
+    </w:tbl>
+    <w:p>
+      <w:pPr>
+        <w:keepNext/>
+        <w:spacing w:after="120" w:before="280"/>
+      </w:pPr>
+      <w:r>
+        <w:rPr>
+          <w:b/>
+          <w:bCs/>
+          <w:color w:val="1F3864"/>
+          <w:sz w:val="26"/>
+          <w:szCs w:val="26"/>
+        </w:rPr>
+        <w:t xml:space="preserve">6. Telemetria REST (exercici 5)</w:t>
+      </w:r>
+    </w:p>
+    <w:p>
+      <w:pPr>
+        <w:keepNext/>
+        <w:spacing w:after="0" w:before="100"/>
+        <w:jc w:val="center"/>
+      </w:pPr>
+      <w:r>
+        <w:drawing>
+          <wp:inline distT="0" distB="0" distL="0" distR="0">
+            <wp:extent cx="5143500" cy="504825"/>
+            <wp:effectExtent t="0" r="0" b="0" l="0"/>
+            <wp:docPr id="1" name="Flux de Node-RED" descr="Flux de Node-RED" title="Flux de Node-RED"/>
+            <wp:cNvGraphicFramePr>
+              <a:graphicFrameLocks xmlns:a="http://schemas.openxmlformats.org/drawingml/2006/main" noChangeAspect="1"/>
+            </wp:cNvGraphicFramePr>
+            <a:graphic xmlns:a="http://schemas.openxmlformats.org/drawingml/2006/main">
+              <a:graphicData uri="http://schemas.openxmlformats.org/drawingml/2006/picture">
+                <pic:pic xmlns:pic="http://schemas.openxmlformats.org/drawingml/2006/picture">
+                  <pic:nvPicPr>
+                    <pic:cNvPr id="0" name="" descr=""/>
+                    <pic:cNvPicPr>
+                      <a:picLocks noChangeAspect="1" noChangeArrowheads="1"/>
+                    </pic:cNvPicPr>
+                  </pic:nvPicPr>
+                  <pic:blipFill>
+                    <a:blip r:embed="rId15" cstate="none"/>
+                    <a:srcRect/>
+                    <a:stretch>
+                      <a:fillRect/>
+                    </a:stretch>
+                  </pic:blipFill>
+                  <pic:spPr bwMode="auto">
+                    <a:xfrm>
+                      <a:off x="0" y="0"/>
+                      <a:ext cx="5143500" cy="504825"/>
+                    </a:xfrm>
+                    <a:prstGeom prst="rect">
+                      <a:avLst/>
+                    </a:prstGeom>
+                  </pic:spPr>
+                </pic:pic>
+              </a:graphicData>
+            </a:graphic>
+          </wp:inline>
+        </w:drawing>
+      </w:r>
+    </w:p>
+    <w:p>
+      <w:pPr>
+        <w:spacing w:after="180" w:before="60"/>
+        <w:jc w:val="center"/>
+      </w:pPr>
+      <w:r>
+        <w:rPr>
+          <w:i/>
+          <w:iCs/>
+          <w:color w:val="404040"/>
+          <w:sz w:val="18"/>
+          <w:szCs w:val="18"/>
+        </w:rPr>
+        <w:t xml:space="preserve">Figura 8. Flux de Node-RED. El fitxer és a /home/pau/dades perquè l'usuari del Raspberry és pau.</w:t>
       </w:r>
     </w:p>
     <w:tbl>
@@ -2200,7 +2450,7 @@
     </w:tbl>
     <w:p>
       <w:pPr>
-        <w:spacing w:after="140" w:before="160" w:line="276"/>
+        <w:spacing w:after="100" w:before="160" w:line="276"/>
       </w:pPr>
       <w:r>
         <w:t xml:space="preserve">En OPERATIU, l'ESP32 envia un POST cada 10 s amb </w:t>
@@ -2258,20 +2508,145 @@
         <w:t xml:space="preserve">temps_activitat</w:t>
       </w:r>
       <w:r>
-        <w:t xml:space="preserve">, registra el codi rebut i compta els enviaments fallits. La IP del Raspberry la dona el DHCP i canvia cada dia, i per això es pot canviar des del port sèrie amb l'ordre </w:t>
-      </w:r>
-      <w:r>
-        <w:rPr>
-          <w:rFonts w:ascii="Consolas" w:cs="Consolas" w:eastAsia="Consolas" w:hAnsi="Consolas"/>
-          <w:sz w:val="18"/>
-          <w:szCs w:val="18"/>
-        </w:rPr>
-        <w:t xml:space="preserve">servidor &lt;ip&gt;</w:t>
-      </w:r>
-      <w:r>
-        <w:t xml:space="preserve">.</w:t>
-      </w:r>
-    </w:p>
+        <w:t xml:space="preserve">, registra el codi rebut i compta els enviaments fallits.</w:t>
+      </w:r>
+    </w:p>
+    <w:tbl>
+      <w:tblPr>
+        <w:tblW w:type="dxa" w:w="9638"/>
+        <w:tblBorders>
+          <w:top w:val="none" w:color="FFFFFF" w:sz="0"/>
+          <w:left w:val="none" w:color="FFFFFF" w:sz="0"/>
+          <w:bottom w:val="none" w:color="FFFFFF" w:sz="0"/>
+          <w:right w:val="none" w:color="FFFFFF" w:sz="0"/>
+          <w:insideH w:val="none" w:color="FFFFFF" w:sz="0"/>
+          <w:insideV w:val="none" w:color="FFFFFF" w:sz="0"/>
+        </w:tblBorders>
+      </w:tblPr>
+      <w:tblGrid>
+        <w:gridCol w:w="4700"/>
+        <w:gridCol w:w="4938"/>
+      </w:tblGrid>
+      <w:tr>
+        <w:trPr>
+          <w:cantSplit/>
+        </w:trPr>
+        <w:tc>
+          <w:tcPr>
+            <w:tcW w:type="dxa" w:w="4700"/>
+            <w:tcBorders>
+              <w:top w:val="none" w:color="FFFFFF" w:sz="0"/>
+              <w:left w:val="none" w:color="FFFFFF" w:sz="0"/>
+              <w:bottom w:val="none" w:color="FFFFFF" w:sz="0"/>
+              <w:right w:val="none" w:color="FFFFFF" w:sz="0"/>
+            </w:tcBorders>
+            <w:tcMar>
+              <w:top w:type="dxa" w:w="120"/>
+              <w:left w:type="dxa" w:w="0"/>
+              <w:right w:type="dxa" w:w="240"/>
+            </w:tcMar>
+          </w:tcPr>
+          <w:p>
+            <w:pPr>
+              <w:spacing w:after="120" w:line="276"/>
+            </w:pPr>
+            <w:r>
+              <w:t xml:space="preserve">La IP del Raspberry la dona el DHCP i canvia cada dia (10.11.0.47 el 05/10 i 10.11.1.11 el 07/10, figura 9). Per això el node no la porta fixa: es canvia des del port sèrie amb l'ordre </w:t>
+            </w:r>
+            <w:r>
+              <w:rPr>
+                <w:rFonts w:ascii="Consolas" w:cs="Consolas" w:eastAsia="Consolas" w:hAnsi="Consolas"/>
+                <w:sz w:val="18"/>
+                <w:szCs w:val="18"/>
+              </w:rPr>
+              <w:t xml:space="preserve">servidor &lt;ip&gt;</w:t>
+            </w:r>
+            <w:r>
+              <w:t xml:space="preserve">.</w:t>
+            </w:r>
+          </w:p>
+        </w:tc>
+        <w:tc>
+          <w:tcPr>
+            <w:tcW w:type="dxa" w:w="4938"/>
+            <w:tcBorders>
+              <w:top w:val="none" w:color="FFFFFF" w:sz="0"/>
+              <w:left w:val="none" w:color="FFFFFF" w:sz="0"/>
+              <w:bottom w:val="none" w:color="FFFFFF" w:sz="0"/>
+              <w:right w:val="none" w:color="FFFFFF" w:sz="0"/>
+            </w:tcBorders>
+            <w:tcMar>
+              <w:top w:type="dxa" w:w="0"/>
+              <w:left w:type="dxa" w:w="120"/>
+              <w:right w:type="dxa" w:w="0"/>
+            </w:tcMar>
+          </w:tcPr>
+          <w:p>
+            <w:pPr>
+              <w:keepNext/>
+              <w:spacing w:after="0" w:before="100"/>
+              <w:jc w:val="center"/>
+            </w:pPr>
+            <w:r>
+              <w:drawing>
+                <wp:inline distT="0" distB="0" distL="0" distR="0">
+                  <wp:extent cx="2952750" cy="361950"/>
+                  <wp:effectExtent t="0" r="0" b="0" l="0"/>
+                  <wp:docPr id="1" name="IP del Raspberry" descr="IP del Raspberry" title="IP del Raspberry"/>
+                  <wp:cNvGraphicFramePr>
+                    <a:graphicFrameLocks xmlns:a="http://schemas.openxmlformats.org/drawingml/2006/main" noChangeAspect="1"/>
+                  </wp:cNvGraphicFramePr>
+                  <a:graphic xmlns:a="http://schemas.openxmlformats.org/drawingml/2006/main">
+                    <a:graphicData uri="http://schemas.openxmlformats.org/drawingml/2006/picture">
+                      <pic:pic xmlns:pic="http://schemas.openxmlformats.org/drawingml/2006/picture">
+                        <pic:nvPicPr>
+                          <pic:cNvPr id="0" name="" descr=""/>
+                          <pic:cNvPicPr>
+                            <a:picLocks noChangeAspect="1" noChangeArrowheads="1"/>
+                          </pic:cNvPicPr>
+                        </pic:nvPicPr>
+                        <pic:blipFill>
+                          <a:blip r:embed="rId16" cstate="none"/>
+                          <a:srcRect/>
+                          <a:stretch>
+                            <a:fillRect/>
+                          </a:stretch>
+                        </pic:blipFill>
+                        <pic:spPr bwMode="auto">
+                          <a:xfrm>
+                            <a:off x="0" y="0"/>
+                            <a:ext cx="2952750" cy="361950"/>
+                          </a:xfrm>
+                          <a:prstGeom prst="rect">
+                            <a:avLst/>
+                          </a:prstGeom>
+                        </pic:spPr>
+                      </pic:pic>
+                    </a:graphicData>
+                  </a:graphic>
+                </wp:inline>
+              </w:drawing>
+            </w:r>
+          </w:p>
+          <w:p>
+            <w:pPr>
+              <w:spacing w:after="180" w:before="60"/>
+              <w:jc w:val="center"/>
+            </w:pPr>
+            <w:r>
+              <w:rPr>
+                <w:i/>
+                <w:iCs/>
+                <w:color w:val="404040"/>
+                <w:sz w:val="18"/>
+                <w:szCs w:val="18"/>
+              </w:rPr>
+              <w:t xml:space="preserve">Figura 9. IP del Raspberry el 07/10.</w:t>
+            </w:r>
+          </w:p>
+        </w:tc>
+      </w:tr>
+    </w:tbl>
     <w:p>
       <w:pPr>
         <w:keepNext/>
@@ -2363,16 +2738,16 @@
     </w:p>
     <w:p>
       <w:pPr>
-        <w:spacing w:after="140" w:line="276"/>
-      </w:pPr>
-      <w:r>
-        <w:t xml:space="preserve">El node segueix en OPERATIU, ho torna a provar cada 10 s i es recupera sol. Les 6 mostres d'aquell minut es perden: al fitxer hi ha un forat de 70 s.</w:t>
+        <w:spacing w:after="120" w:line="276"/>
+      </w:pPr>
+      <w:r>
+        <w:t xml:space="preserve">El node segueix en OPERATIU, ho torna a provar cada 10 s i es recupera sol. Les 6 mostres d'aquell minut es perden (forat de 70 s al fitxer).</w:t>
       </w:r>
     </w:p>
     <w:p>
       <w:pPr>
         <w:keepNext/>
-        <w:spacing w:after="140" w:before="320"/>
+        <w:spacing w:after="120" w:before="280"/>
       </w:pPr>
       <w:r>
         <w:rPr>
@@ -2395,7 +2770,7 @@
         <w:spacing w:after="80" w:line="276"/>
       </w:pPr>
       <w:r>
-        <w:t xml:space="preserve">Funciona tot el cicle: configuració per BLE, NVS, reinici, restabliment de fàbrica i telemetria REST.</w:t>
+        <w:t xml:space="preserve">Funciona tot el cicle: configuració per BLE, NVS, reinici, restabliment i telemetria REST.</w:t>
       </w:r>
     </w:p>
     <w:p>
@@ -2421,7 +2796,7 @@
         <w:spacing w:after="80" w:line="276"/>
       </w:pPr>
       <w:r>
-        <w:t xml:space="preserve">Problemes: la IP del Raspberry canvia cada dia, un mal contacte del DHT22 i les notificacions a l'iPhone.</w:t>
+        <w:t xml:space="preserve">Problemes: la IP del Raspberry canvia cada dia, el DHT22 tenia un mal contacte i l'iPhone no activava les notificacions.</w:t>
       </w:r>
     </w:p>
     <w:p>
@@ -2434,7 +2809,7 @@
         <w:spacing w:after="80" w:line="276"/>
       </w:pPr>
       <w:r>
-        <w:t xml:space="preserve">Millores: guardar les mostres no enviades i reenviar-les després, fer el POST en una tasca a part i esborrar també la còpia de la clau que guarda el driver de la Wi-Fi.</w:t>
+        <w:t xml:space="preserve">Millores: reenviar les mostres perdudes, fer el POST en una tasca a part i esborrar també la còpia de la clau del driver Wi-Fi.</w:t>
       </w:r>
     </w:p>
     <w:sectPr>

</xml_diff>